<commit_message>
Revisar claridad y redacción del manual de usuario
</commit_message>
<xml_diff>
--- a/docs/manual-usuario/Manual_de_usuario_SFA_Aire.docx
+++ b/docs/manual-usuario/Manual_de_usuario_SFA_Aire.docx
@@ -25,23 +25,23 @@
         <w:rPr>
           <w:b w:val="0"/>
         </w:rPr>
-        <w:t>Edición del 27 de octubre de 2026. Windows y portal 0.8.0. Android 0.8.2 disponible en la entrega local del responsable.</w:t>
-      </w:r>
-    </w:p>
-    <w:p>
-      <w:r>
-        <w:rPr>
-          <w:b w:val="0"/>
-        </w:rPr>
-        <w:t>Esta guía permite que una persona con los archivos oficiales y un acceso autorizado pueda instalar el sistema, activar su cuenta, consultar las mediciones y recibir o atender avisos. También explica las tareas del administrador y cómo conectar la maqueta a una PC.</w:t>
-      </w:r>
-    </w:p>
-    <w:p>
-      <w:r>
-        <w:rPr>
-          <w:b w:val="0"/>
-        </w:rPr>
-        <w:t>Los archivos por sí solos no crean una cuenta ni conceden permisos. Para ingresar necesita una invitación del administrador o una cuenta ya asignada a un aula. La infraestructura de esta instalación está preparada; crear una institución o un proyecto cloud nuevo requiere intervención técnica independiente.</w:t>
+        <w:t>Edición revisada del 27 de octubre de 2026. Para Windows y portal 0.8.0 y app Android 0.8.2.</w:t>
+      </w:r>
+    </w:p>
+    <w:p>
+      <w:r>
+        <w:rPr>
+          <w:b w:val="0"/>
+        </w:rPr>
+        <w:t>Esta guía explica cómo instalar SFA Aire, activar su cuenta, consultar las mediciones y recibir avisos en el teléfono. También incluye las tareas del administrador y la conexión de la maqueta Arduino a una PC.</w:t>
+      </w:r>
+    </w:p>
+    <w:p>
+      <w:r>
+        <w:rPr>
+          <w:b w:val="0"/>
+        </w:rPr>
+        <w:t>Para ingresar necesita una invitación del administrador o una cuenta que ya tenga acceso a un aula. Descargar el programa no crea esa cuenta. El manual supone que la institución ya tiene configurados los servicios de internet que utiliza SFA Aire; si comienza desde cero, solicite primero esa preparación al responsable técnico.</w:t>
       </w:r>
     </w:p>
     <w:p>
@@ -90,23 +90,23 @@
         <w:rPr>
           <w:b w:val="0"/>
         </w:rPr>
-        <w:t>Qué encontrará: recorridos numerados, resultados esperados, explicación de cada apartado, capturas de referencia y soluciones a problemas frecuentes. Los nombres en negrita corresponden a controles o mensajes del sistema.</w:t>
-      </w:r>
-    </w:p>
-    <w:p>
-      <w:r>
-        <w:rPr>
-          <w:b w:val="0"/>
-        </w:rPr>
-        <w:t>Alcance de las imágenes: se utilizan capturas de la aplicación y del portal en demostración, emulador o pruebas controladas. Las cuentas y mediciones de ejemplo no son datos de un aula real. Las fechas de ejemplo no deben interpretarse como la fecha de su instalación.</w:t>
-      </w:r>
-    </w:p>
-    <w:p>
-      <w:r>
-        <w:rPr>
-          <w:b w:val="0"/>
-        </w:rPr>
-        <w:t>SFA Aire es un prototipo educativo de observación ambiental relativa. El MQ135 no mide CO₂, AQI ni ppm certificadas. Las lecturas y avisos apoyan la revisión humana; no certifican salubridad ni deciden automáticamente una evacuación.</w:t>
+        <w:t>Los capítulos presentan los pasos de cada tarea y explican qué debería aparecer en pantalla. Los nombres en negrita corresponden a botones, campos o mensajes del sistema.</w:t>
+      </w:r>
+    </w:p>
+    <w:p>
+      <w:r>
+        <w:rPr>
+          <w:b w:val="0"/>
+        </w:rPr>
+        <w:t>Las capturas muestran pantallas de demostración o pruebas. Sus cuentas, valores y fechas son ejemplos. Las imágenes de Android se obtuvieron en un emulador, es decir, un teléfono virtual ejecutado en la PC.</w:t>
+      </w:r>
+    </w:p>
+    <w:p>
+      <w:r>
+        <w:rPr>
+          <w:b w:val="0"/>
+        </w:rPr>
+        <w:t>SFA Aire es un prototipo educativo para observar temperatura, humedad y cambios en la señal del MQ135. Esta versión no calcula concentraciones de CO₂, valores en ppm ni índices de calidad del aire como AQI. Sus avisos indican que conviene revisar la situación; no certifican que el aula sea saludable ni ordenan una evacuación.</w:t>
       </w:r>
     </w:p>
     <w:p>
@@ -164,7 +164,7 @@
           <w:rPr>
             <w:color w:val="285A49"/>
           </w:rPr>
-          <w:t>02 Archivos requisitos y versiones   ·   pág. 4</w:t>
+          <w:t>02 Requisitos y archivos de instalación   ·   pág. 4</w:t>
         </w:r>
       </w:hyperlink>
     </w:p>
@@ -182,7 +182,7 @@
           <w:rPr>
             <w:color w:val="285A49"/>
           </w:rPr>
-          <w:t>03 Elegir entre portal app y demostración   ·   pág. 5</w:t>
+          <w:t>03 Elegir cómo acceder al sistema   ·   pág. 5</w:t>
         </w:r>
       </w:hyperlink>
     </w:p>
@@ -200,7 +200,7 @@
           <w:rPr>
             <w:color w:val="285A49"/>
           </w:rPr>
-          <w:t>04 Instalar Windows y abrir el panel   ·   pág. 6</w:t>
+          <w:t>04 Instalar SFA Aire en Windows   ·   pág. 6</w:t>
         </w:r>
       </w:hyperlink>
     </w:p>
@@ -236,7 +236,7 @@
           <w:rPr>
             <w:color w:val="285A49"/>
           </w:rPr>
-          <w:t>06 Ingresar seleccionar aula y cerrar sesión   ·   pág. 8</w:t>
+          <w:t>06 Iniciar sesión y elegir un aula   ·   pág. 8</w:t>
         </w:r>
       </w:hyperlink>
     </w:p>
@@ -254,7 +254,7 @@
           <w:rPr>
             <w:color w:val="285A49"/>
           </w:rPr>
-          <w:t>07 Recorrer el portal y consultar Mis aulas   ·   pág. 9</w:t>
+          <w:t>07 Consultar las mediciones en el portal   ·   pág. 9</w:t>
         </w:r>
       </w:hyperlink>
     </w:p>
@@ -272,7 +272,7 @@
           <w:rPr>
             <w:color w:val="285A49"/>
           </w:rPr>
-          <w:t>08 Entender estados antigüedad y mediciones   ·   pág. 10</w:t>
+          <w:t>08 Interpretar las mediciones y sus estados   ·   pág. 10</w:t>
         </w:r>
       </w:hyperlink>
     </w:p>
@@ -326,7 +326,7 @@
           <w:rPr>
             <w:color w:val="285A49"/>
           </w:rPr>
-          <w:t>11 Instalar o actualizar Android   ·   pág. 13</w:t>
+          <w:t>11 Instalar o actualizar la app Android   ·   pág. 13</w:t>
         </w:r>
       </w:hyperlink>
     </w:p>
@@ -416,7 +416,7 @@
           <w:rPr>
             <w:color w:val="285A49"/>
           </w:rPr>
-          <w:t>16 Administrar aulas y sus datos   ·   pág. 18</w:t>
+          <w:t>16 Crear y editar aulas   ·   pág. 18</w:t>
         </w:r>
       </w:hyperlink>
     </w:p>
@@ -470,7 +470,7 @@
           <w:rPr>
             <w:color w:val="285A49"/>
           </w:rPr>
-          <w:t>19 Asignar esta PC y conectar Arduino   ·   pág. 21</w:t>
+          <w:t>19 Vincular la PC y conectar Arduino   ·   pág. 21</w:t>
         </w:r>
       </w:hyperlink>
     </w:p>
@@ -560,7 +560,7 @@
           <w:rPr>
             <w:color w:val="285A49"/>
           </w:rPr>
-          <w:t>24 Resolver problemas de acceso lecturas y avisos   ·   pág. 26</w:t>
+          <w:t>24 Solucionar problemas frecuentes   ·   pág. 26</w:t>
         </w:r>
       </w:hyperlink>
     </w:p>
@@ -578,7 +578,7 @@
           <w:rPr>
             <w:color w:val="285A49"/>
           </w:rPr>
-          <w:t>25 Cerrar actualizar y proteger la instalación   ·   pág. 27</w:t>
+          <w:t>25 Cerrar el sistema y cuidar sus datos   ·   pág. 27</w:t>
         </w:r>
       </w:hyperlink>
     </w:p>
@@ -596,7 +596,7 @@
           <w:rPr>
             <w:color w:val="285A49"/>
           </w:rPr>
-          <w:t>26 Comprobación de primera puesta en funcionamiento   ·   pág. 28</w:t>
+          <w:t>26 Comprobar el primer uso   ·   pág. 28</w:t>
         </w:r>
       </w:hyperlink>
     </w:p>
@@ -614,7 +614,7 @@
           <w:rPr>
             <w:color w:val="285A49"/>
           </w:rPr>
-          <w:t>27 Glosario alcance y referencias de la guía   ·   pág. 29</w:t>
+          <w:t>27 Glosario y referencias   ·   pág. 29</w:t>
         </w:r>
       </w:hyperlink>
     </w:p>
@@ -623,7 +623,7 @@
         <w:rPr>
           <w:b w:val="0"/>
         </w:rPr>
-        <w:t>Cómo leer los pasos: realice las acciones en el orden indicado y compruebe el resultado esperado antes de seguir. Si falta una opción, revise primero el aula y el permiso de su cuenta. Un control deshabilitado en demostración no indica necesariamente una avería.</w:t>
+        <w:t>Siga los pasos en orden y compruebe lo que aparece en pantalla antes de continuar. Si falta una opción, revise el aula seleccionada y su permiso. En demostración, algunas acciones están deshabilitadas porque no se guardan cambios.</w:t>
       </w:r>
     </w:p>
     <w:p>
@@ -654,7 +654,7 @@
         <w:rPr>
           <w:b w:val="0"/>
         </w:rPr>
-        <w:t>SFA Aire reúne temperatura, humedad y señal relativa MQ135 de una maqueta Arduino. Una PC recibe los datos por USB y los sincroniza. El portal y Android permiten consultar las aulas autorizadas; el servicio cloud envía avisos a los teléfonos registrados.</w:t>
+        <w:t>La maqueta Arduino envía temperatura, humedad y señal MQ135 a una PC mediante USB. La PC guarda esos datos y envía una copia a los servicios de internet del proyecto, llamados nube en este manual. Desde allí se consultan en el portal y en Android, y se envían notificaciones al teléfono, también llamadas push.</w:t>
       </w:r>
     </w:p>
     <w:p>
@@ -667,7 +667,7 @@
         <w:drawing>
           <wp:inline xmlns:a="http://schemas.openxmlformats.org/drawingml/2006/main" xmlns:pic="http://schemas.openxmlformats.org/drawingml/2006/picture">
             <wp:extent cx="6080760" cy="1786223"/>
-            <wp:docPr id="2" name="Picture 2" descr="Recorrido de uso del sistema. Esquema explicativo, no evidencia de sensores o recepción física."/>
+            <wp:docPr id="2" name="Picture 2" descr="Cómo llegan las mediciones desde Arduino hasta el portal y el teléfono."/>
             <wp:cNvGraphicFramePr>
               <a:graphicFrameLocks noChangeAspect="1"/>
             </wp:cNvGraphicFramePr>
@@ -703,15 +703,15 @@
         <w:pStyle w:val="Caption"/>
       </w:pPr>
       <w:r>
-        <w:t>Recorrido de uso del sistema. Esquema explicativo, no evidencia de sensores o recepción física.</w:t>
-      </w:r>
-    </w:p>
-    <w:p>
-      <w:r>
-        <w:rPr>
-          <w:b w:val="0"/>
-        </w:rPr>
-        <w:t>La PC y el Arduino deben permanecer encendidos para obtener nuevas mediciones físicas. Una vez guardado un evento en la nube, su envío remoto no depende del receptor PC. Poder abrir el portal con la PC apagada no significa que se estén obteniendo muestras nuevas.</w:t>
+        <w:t>Cómo llegan las mediciones desde Arduino hasta el portal y el teléfono.</w:t>
+      </w:r>
+    </w:p>
+    <w:p>
+      <w:r>
+        <w:rPr>
+          <w:b w:val="0"/>
+        </w:rPr>
+        <w:t>La PC y el Arduino deben permanecer encendidos para obtener nuevas mediciones. El programa de la PC que recibe los datos se llama receptor. Una vez guardado un aviso en la nube, puede enviarse al teléfono aunque ese receptor se detenga. Con la PC apagada podrá consultar los datos guardados, pero no recibirá nuevas mediciones de esa maqueta.</w:t>
       </w:r>
     </w:p>
     <w:tbl>
@@ -956,15 +956,15 @@
         <w:rPr>
           <w:b w:val="0"/>
         </w:rPr>
-        <w:t>Los permisos son por aula. La misma cuenta puede tener funciones diferentes al cambiar de aula. Crear aulas nuevas requiere una capacidad institucional específica: administrar un aula no garantiza ese permiso.</w:t>
-      </w:r>
-    </w:p>
-    <w:p>
-      <w:r>
-        <w:rPr>
-          <w:b w:val="0"/>
-        </w:rPr>
-        <w:t>Resultado esperado: cada persona identifica si necesita solo navegador, app Android o una PC con Arduino. Los teléfonos no se registran como PC receptoras.</w:t>
+        <w:t>Los permisos se asignan por aula. Por eso, al cambiar de aula puede encontrar opciones diferentes. Crear aulas nuevas requiere una autorización adicional; no todas las cuentas administradoras la tienen.</w:t>
+      </w:r>
+    </w:p>
+    <w:p>
+      <w:r>
+        <w:rPr>
+          <w:b w:val="0"/>
+        </w:rPr>
+        <w:t>Para consultar basta un navegador o la app Android. Para recibir mediciones nuevas del Arduino, además necesita la PC receptora. Un teléfono no reemplaza a esa PC.</w:t>
       </w:r>
     </w:p>
     <w:p>
@@ -977,7 +977,7 @@
         <w:pStyle w:val="Heading1"/>
       </w:pPr>
       <w:r>
-        <w:t>02 Archivos requisitos y versiones</w:t>
+        <w:t>02 Requisitos y archivos de instalación</w:t>
       </w:r>
       <w:bookmarkStart w:id="3" w:name="cap_3"/>
       <w:bookmarkEnd w:id="3"/>
@@ -987,7 +987,7 @@
         <w:rPr>
           <w:b w:val="0"/>
         </w:rPr>
-        <w:t>Use los archivos oficiales de https://github.com/hfreedo/SFA-Aire-Portal/releases. Identifique el nombre exacto antes de descargar: la página puede mostrar varias entregas históricas.</w:t>
+        <w:t>Los archivos publicados se encuentran en https://github.com/hfreedo/SFA-Aire-Portal/releases. Esa página reúne versiones anteriores y actuales: compruebe el nombre del archivo antes de descargarlo.</w:t>
       </w:r>
     </w:p>
     <w:tbl>
@@ -1326,7 +1326,7 @@
                 <w:color w:val="000000"/>
                 <w:sz w:val="19"/>
               </w:rPr>
-              <w:t>Placa y firmware compatibles, sensores preparados, cable USB de datos y controlador USB si corresponde.</w:t>
+              <w:t>Placa con el programa de Arduino correspondiente, sensores preparados, cable USB de datos y controlador USB si corresponde.</w:t>
             </w:r>
           </w:p>
         </w:tc>
@@ -1342,31 +1342,31 @@
         <w:rPr>
           <w:b w:val="0"/>
         </w:rPr>
-        <w:t>El ZIP Windows 0.8.0 conserva la APK 0.8.0 de su entrega original. Para las funciones Android que describe este manual, utilice la APK 0.8.2 separada. Una descarga Wi-Fi desde un portable antiguo puede entregar una APK anterior; compruebe la versión en Ajustes. Al verificar los releases el 27 de octubre, Android 0.8.1 estaba publicado por separado y 0.8.2 todavía no aparecía: no busque un release 0.8.2 si aún no está disponible.</w:t>
-      </w:r>
-    </w:p>
-    <w:p>
-      <w:r>
-        <w:rPr>
-          <w:b w:val="0"/>
-        </w:rPr>
-        <w:t>El portable incluye sus componentes de ejecución: no necesita instalar Python ni Node.js para usarlo. La placa Arduino requiere su firmware y, según el modelo, un controlador USB preparado por el responsable técnico.</w:t>
-      </w:r>
-    </w:p>
-    <w:p>
-      <w:r>
-        <w:rPr>
-          <w:b w:val="0"/>
-        </w:rPr>
-        <w:t>Los ejecutables Windows no tienen firma Authenticode. La APK utiliza firma piloto debug; no es una publicación de producción en Play Store. Compruebe la procedencia y los hashes del release. No desactive globalmente las protecciones de Windows o Android para instalar.</w:t>
-      </w:r>
-    </w:p>
-    <w:p>
-      <w:r>
-        <w:rPr>
-          <w:b w:val="0"/>
-        </w:rPr>
-        <w:t>Si recibió únicamente fuentes y archivos de desarrollo, solicite el portable al responsable. Los scripts de compilación y las migraciones de base de datos no forman parte del primer uso de una persona usuaria.</w:t>
+        <w:t>Un portable es un programa que se utiliza después de extraer su carpeta, sin un instalador adicional. El ZIP Windows 0.8.0 incluye la app Android 0.8.0. Este manual describe Android 0.8.2: solicite ese APK por separado al responsable. APK es el archivo de instalación de Android. Al revisar las descargas el 27 de octubre, la actualización pública era 0.8.1 y la 0.8.2 solo estaba disponible en la carpeta del proyecto.</w:t>
+      </w:r>
+    </w:p>
+    <w:p>
+      <w:r>
+        <w:rPr>
+          <w:b w:val="0"/>
+        </w:rPr>
+        <w:t>El portable ya contiene lo necesario para ejecutar SFA Aire: no necesita instalar Python ni Node.js. La placa Arduino sí debe tener cargado su programa. Según el modelo, el responsable técnico también debe instalar un controlador para que Windows reconozca el USB.</w:t>
+      </w:r>
+    </w:p>
+    <w:p>
+      <w:r>
+        <w:rPr>
+          <w:b w:val="0"/>
+        </w:rPr>
+        <w:t>Windows puede mostrar una advertencia porque los ejecutables no tienen firma digital de editor. La app Android es una versión piloto, no una publicación en Play Store. Use los archivos entregados por el responsable o por el repositorio oficial. Si duda de un archivo, solicite que se compare su código de comprobación SHA256. No desactive las protecciones generales del equipo.</w:t>
+      </w:r>
+    </w:p>
+    <w:p>
+      <w:r>
+        <w:rPr>
+          <w:b w:val="0"/>
+        </w:rPr>
+        <w:t>Si recibió solamente código fuente, solicite el portable al responsable. Para usar el sistema no necesita compilar programas ni modificar la base de datos.</w:t>
       </w:r>
     </w:p>
     <w:p>
@@ -1379,7 +1379,7 @@
         <w:pStyle w:val="Heading1"/>
       </w:pPr>
       <w:r>
-        <w:t>03 Elegir entre portal app y demostración</w:t>
+        <w:t>03 Elegir cómo acceder al sistema</w:t>
       </w:r>
       <w:bookmarkStart w:id="4" w:name="cap_4"/>
       <w:bookmarkEnd w:id="4"/>
@@ -1389,7 +1389,7 @@
         <w:rPr>
           <w:b w:val="0"/>
         </w:rPr>
-        <w:t>El acceso web público es https://sfa-aire-aulas.web.app/remoto. Permite consultar aulas, avisos e historial y usar las funciones administrativas autorizadas. No abre el USB del teléfono ni convierte cualquier navegador en receptor Arduino.</w:t>
+        <w:t>El portal en internet es https://sfa-aire-aulas.web.app/remoto. Puede abrirlo desde una PC o un teléfono para consultar sus aulas, avisos e historial. También permite administrar el sistema si su cuenta tiene ese permiso. Para conectar el Arduino por USB debe usar el panel de Windows.</w:t>
       </w:r>
     </w:p>
     <w:p>
@@ -1509,15 +1509,38 @@
         <w:rPr>
           <w:b w:val="0"/>
         </w:rPr>
-        <w:t>Es importante distinguir dos situaciones: la demostración de interfaz no envía notificaciones ni cambia la nube; un ensayo administrativo real del Laboratorio sí puede guardar datos sintéticos y enviar un push real rotulado SIMULACIÓN.</w:t>
-      </w:r>
-    </w:p>
-    <w:p>
-      <w:r>
-        <w:rPr>
-          <w:b w:val="0"/>
-        </w:rPr>
-        <w:t>Resultado esperado: sabe si está observando una maqueta real, explorando ejemplos o ejecutando una prueba autorizada. No use una demostración como evidencia de que el teléfono quedó registrado.</w:t>
+      </w:r>
+      <w:r>
+        <w:rPr>
+          <w:b/>
+        </w:rPr>
+        <w:t>Explorar demostración</w:t>
+      </w:r>
+      <w:r>
+        <w:rPr>
+          <w:b w:val="0"/>
+        </w:rPr>
+        <w:t xml:space="preserve"> sirve para conocer las pantallas sin guardar ni enviar nada. En cambio, las pruebas del </w:t>
+      </w:r>
+      <w:r>
+        <w:rPr>
+          <w:b/>
+        </w:rPr>
+        <w:t>Laboratorio</w:t>
+      </w:r>
+      <w:r>
+        <w:rPr>
+          <w:b w:val="0"/>
+        </w:rPr>
+        <w:t>, iniciadas por un administrador con su cuenta, pueden guardar mediciones de ejemplo y enviar notificaciones reales con el rótulo SIMULACIÓN.</w:t>
+      </w:r>
+    </w:p>
+    <w:p>
+      <w:r>
+        <w:rPr>
+          <w:b w:val="0"/>
+        </w:rPr>
+        <w:t>Para comprobar que un teléfono recibe avisos, registre la app y siga la prueba del capítulo 22. Recorrer la demostración no realiza ese registro.</w:t>
       </w:r>
     </w:p>
     <w:p>
@@ -1530,7 +1553,7 @@
         <w:pStyle w:val="Heading1"/>
       </w:pPr>
       <w:r>
-        <w:t>04 Instalar Windows y abrir el panel</w:t>
+        <w:t>04 Instalar SFA Aire en Windows</w:t>
       </w:r>
       <w:bookmarkStart w:id="5" w:name="cap_5"/>
       <w:bookmarkEnd w:id="5"/>
@@ -1810,7 +1833,7 @@
                 <w:color w:val="000000"/>
                 <w:sz w:val="19"/>
               </w:rPr>
-              <w:t>Lleva al recorrido del portal local para vincular y conectar la placa.</w:t>
+              <w:t>Abre el portal de esta PC para asignarle un aula y conectar la placa.</w:t>
             </w:r>
           </w:p>
         </w:tc>
@@ -2058,7 +2081,7 @@
         <w:rPr>
           <w:b w:val="0"/>
         </w:rPr>
-        <w:t xml:space="preserve"> si la PC seguirá adquiriendo datos, o </w:t>
+        <w:t xml:space="preserve"> si la PC debe seguir recibiendo mediciones, o </w:t>
       </w:r>
       <w:r>
         <w:rPr>
@@ -2070,15 +2093,15 @@
         <w:rPr>
           <w:b w:val="0"/>
         </w:rPr>
-        <w:t xml:space="preserve"> para terminar. Cerrar una pestaña del navegador no detiene por sí solo el receptor.</w:t>
-      </w:r>
-    </w:p>
-    <w:p>
-      <w:r>
-        <w:rPr>
-          <w:b w:val="0"/>
-        </w:rPr>
-        <w:t>Resultado esperado: aparece la pantalla de acceso o la demostración. El receptor escucha en localhost por defecto; no necesita abrir puertos del router. Si no abre, revise el diagnóstico del panel antes de intentar otra instalación.</w:t>
+        <w:t xml:space="preserve"> para terminar. Cerrar una pestaña del navegador no detiene el receptor.</w:t>
+      </w:r>
+    </w:p>
+    <w:p>
+      <w:r>
+        <w:rPr>
+          <w:b w:val="0"/>
+        </w:rPr>
+        <w:t>Debería abrirse la pantalla de acceso o la demostración. El receptor se comunica con el navegador dentro de la misma PC; no necesita cambiar el router. Si no se abre, consulte el estado que muestra el panel antes de intentar otra instalación.</w:t>
       </w:r>
     </w:p>
     <w:p>
@@ -2101,7 +2124,7 @@
         <w:rPr>
           <w:b w:val="0"/>
         </w:rPr>
-        <w:t>El alta no es libre. Solicite al administrador una invitación para su correo y su aula. El administrador comparte un enlace privado o QR; el sistema no envía correo automáticamente. El enlace vence en una hora y puede revocarse.</w:t>
+        <w:t>Para crear su cuenta, pida al administrador una invitación para su correo y su aula. Recibirá un enlace privado o un código QR que deberá abrir o escanear. El sistema no envía ese enlace por correo automáticamente: el administrador debe compartirlo con usted. La invitación vence en una hora.</w:t>
       </w:r>
     </w:p>
     <w:p>
@@ -2209,7 +2232,7 @@
         <w:rPr>
           <w:b w:val="0"/>
         </w:rPr>
-        <w:t>. Debe tener entre 12 y 128 caracteres. No utilice la contraseña ilustrada ni se la envíe al administrador.</w:t>
+        <w:t>. Debe tener entre 12 y 128 caracteres. Guárdela en un lugar seguro y no se la envíe al administrador.</w:t>
       </w:r>
     </w:p>
     <w:p>
@@ -2346,7 +2369,7 @@
         <w:rPr>
           <w:b w:val="0"/>
         </w:rPr>
-        <w:t>Si el enlace venció, fue revocado o no corresponde a su correo, solicite uno nuevo. Si olvidó una contraseña existente, contacte al administrador: la pantalla actual no ofrece recuperación autoservicio. Aceptar una invitación no activa los avisos del teléfono; complete el capítulo 15.</w:t>
+        <w:t>Si el enlace venció, fue revocado o no corresponde a su correo, solicite uno nuevo. Si olvidó su contraseña, contacte al administrador: esta versión no tiene un botón para recuperarla desde el acceso. Después de ingresar, active los avisos del teléfono como se explica en el capítulo 15.</w:t>
       </w:r>
     </w:p>
     <w:p>
@@ -2359,7 +2382,7 @@
         <w:pStyle w:val="Heading1"/>
       </w:pPr>
       <w:r>
-        <w:t>06 Ingresar seleccionar aula y cerrar sesión</w:t>
+        <w:t>06 Iniciar sesión y elegir un aula</w:t>
       </w:r>
       <w:bookmarkStart w:id="7" w:name="cap_7"/>
       <w:bookmarkEnd w:id="7"/>
@@ -2445,7 +2468,7 @@
         <w:rPr>
           <w:b w:val="0"/>
         </w:rPr>
-        <w:t>3. Espere a que se verifiquen la cuenta y las aulas. Una pantalla de carga o error no significa que tenga cero aulas.</w:t>
+        <w:t>3. Espere a que termine de cargar la lista de aulas. Si aparece un error, use la opción de reintento; todavía no se pudo consultar la lista.</w:t>
       </w:r>
     </w:p>
     <w:p>
@@ -2493,15 +2516,15 @@
         <w:rPr>
           <w:b w:val="0"/>
         </w:rPr>
-        <w:t xml:space="preserve"> para solicitar el estado verificado cuando lo necesite.</w:t>
-      </w:r>
-    </w:p>
-    <w:p>
-      <w:r>
-        <w:rPr>
-          <w:b w:val="0"/>
-        </w:rPr>
-        <w:t>Si la cuenta no tiene aulas, solicite al responsable que revise la invitación y la membresía. Tener cuenta no implica acceso a todas las aulas. Si ingresa con otra cuenta, cierre primero la sesión actual.</w:t>
+        <w:t xml:space="preserve"> para volver a consultar los datos.</w:t>
+      </w:r>
+    </w:p>
+    <w:p>
+      <w:r>
+        <w:rPr>
+          <w:b w:val="0"/>
+        </w:rPr>
+        <w:t>Si la lista se cargó pero no tiene aulas, pida al responsable que revise su invitación y su acceso al aula. Tener cuenta no le da acceso a todas las aulas. Para usar otra cuenta, cierre primero la sesión actual.</w:t>
       </w:r>
     </w:p>
     <w:p>
@@ -2622,7 +2645,7 @@
         <w:rPr>
           <w:b w:val="0"/>
         </w:rPr>
-        <w:t>Resultado esperado: el nombre del aula y las opciones disponibles corresponden a su cuenta. No deben aparecer campos para introducir claves administrativas de Supabase o Firebase.</w:t>
+        <w:t>Al ingresar debería ver el nombre de su aula y las opciones permitidas para su cuenta. El acceso habitual pide correo y contraseña; no necesita claves administrativas de Supabase o Firebase.</w:t>
       </w:r>
     </w:p>
     <w:p>
@@ -2635,7 +2658,7 @@
         <w:pStyle w:val="Heading1"/>
       </w:pPr>
       <w:r>
-        <w:t>07 Recorrer el portal y consultar Mis aulas</w:t>
+        <w:t>07 Consultar las mediciones en el portal</w:t>
       </w:r>
       <w:bookmarkStart w:id="8" w:name="cap_8"/>
       <w:bookmarkEnd w:id="8"/>
@@ -2814,7 +2837,7 @@
         <w:rPr>
           <w:b w:val="0"/>
         </w:rPr>
-        <w:t xml:space="preserve"> de </w:t>
+        <w:t xml:space="preserve">, que corresponde a la maqueta, de </w:t>
       </w:r>
       <w:r>
         <w:rPr>
@@ -2826,7 +2849,7 @@
         <w:rPr>
           <w:b w:val="0"/>
         </w:rPr>
-        <w:t>. Las muestras físicas y sintéticas no representan el mismo origen.</w:t>
+        <w:t>, que contiene valores generados para ensayar el sistema.</w:t>
       </w:r>
     </w:p>
     <w:p>
@@ -2838,7 +2861,19 @@
         <w:rPr>
           <w:b w:val="0"/>
         </w:rPr>
-        <w:t>3. Lea temperatura en °C, humedad en % y señal MQ135 en ADC o veces su referencia. Revise también el estado y la antigüedad de la muestra.</w:t>
+        <w:t xml:space="preserve">3. Lea temperatura en °C, humedad en % y señal MQ135 en ADC. ADC es el número de la lectura analógica, no una concentración de gas. El valor </w:t>
+      </w:r>
+      <w:r>
+        <w:rPr>
+          <w:b/>
+        </w:rPr>
+        <w:t>× referencia</w:t>
+      </w:r>
+      <w:r>
+        <w:rPr>
+          <w:b w:val="0"/>
+        </w:rPr>
+        <w:t xml:space="preserve"> compara esa señal con la referencia guardada. Revise también cuándo se recibió la muestra.</w:t>
       </w:r>
     </w:p>
     <w:p>
@@ -2936,7 +2971,7 @@
         <w:rPr>
           <w:b w:val="0"/>
         </w:rPr>
-        <w:t xml:space="preserve"> significa que no hay avisos abiertos dentro del estado consultado. No demuestra que haya lectura actual ni que el ambiente sea saludable. Revise siempre fuente, vigencia y sensores.</w:t>
+        <w:t xml:space="preserve"> significa que la consulta no muestra avisos por atender. Compruebe también el origen y la fecha de la última lectura: puede no haber avisos aunque la maqueta esté desconectada.</w:t>
       </w:r>
     </w:p>
     <w:p>
@@ -2949,7 +2984,7 @@
         <w:pStyle w:val="Heading1"/>
       </w:pPr>
       <w:r>
-        <w:t>08 Entender estados antigüedad y mediciones</w:t>
+        <w:t>08 Interpretar las mediciones y sus estados</w:t>
       </w:r>
       <w:bookmarkStart w:id="9" w:name="cap_9"/>
       <w:bookmarkEnd w:id="9"/>
@@ -3070,7 +3105,7 @@
                 <w:color w:val="000000"/>
                 <w:sz w:val="19"/>
               </w:rPr>
-              <w:t>La regla no confirma una variación en las muestras válidas. No es una certificación sanitaria.</w:t>
+              <w:t>No se confirmó una variación que cumpla los umbrales y tiempos configurados. No es una certificación sanitaria.</w:t>
             </w:r>
           </w:p>
         </w:tc>
@@ -3345,7 +3380,7 @@
                 <w:color w:val="000000"/>
                 <w:sz w:val="19"/>
               </w:rPr>
-              <w:t>El MQ135 necesita una referencia experimental válida y su confirmación.</w:t>
+              <w:t>Falta medir y guardar la referencia del MQ135, o confirmar que el sensor fue acondicionado.</w:t>
             </w:r>
           </w:p>
         </w:tc>
@@ -3400,7 +3435,7 @@
                 <w:color w:val="000000"/>
                 <w:sz w:val="19"/>
               </w:rPr>
-              <w:t>No hay una medición vigente verificable. Los valores anteriores son históricos.</w:t>
+              <w:t>La última lectura ya es antigua o no hay datos. No permite conocer el estado actual.</w:t>
             </w:r>
           </w:p>
         </w:tc>
@@ -3455,7 +3490,7 @@
                 <w:color w:val="000000"/>
                 <w:sz w:val="19"/>
               </w:rPr>
-              <w:t>La adquisición está detenida. No habrá nuevas muestras hasta reanudarla.</w:t>
+              <w:t>El receptor no está recibiendo mediciones. Debe iniciarse de nuevo para obtenerlas.</w:t>
             </w:r>
           </w:p>
         </w:tc>
@@ -3471,31 +3506,55 @@
         <w:rPr>
           <w:b w:val="0"/>
         </w:rPr>
-        <w:t>El receptor USB considera vencida una lectura tras más de 10 segundos sin muestra válida. La consulta cloud permite hasta 95 segundos de antigüedad porque la sincronización normal es aproximadamente cada minuto. Son criterios de vigencia distintos; no espere que ambas pantallas actualicen al mismo segundo.</w:t>
-      </w:r>
-    </w:p>
-    <w:p>
-      <w:r>
-        <w:rPr>
-          <w:b w:val="0"/>
-        </w:rPr>
-        <w:t>La fecha del aviso y la fecha de la lectura actual también son distintas. En Android puede tocar la antigüedad para ver la fecha exacta. Una entrega atrasada conserva su fecha; no debe interpretarse como una alerta recién medida.</w:t>
-      </w:r>
-    </w:p>
-    <w:p>
-      <w:r>
-        <w:rPr>
-          <w:b w:val="0"/>
-        </w:rPr>
-        <w:t>El DHT mide temperatura y humedad. El MQ135 es multisensible y depende de alimentación, acondicionamiento y referencia. Un valor como 560 ADC no equivale a 560 ppm. El cociente × referencia tampoco identifica un gas.</w:t>
-      </w:r>
-    </w:p>
-    <w:p>
-      <w:r>
-        <w:rPr>
-          <w:b w:val="0"/>
-        </w:rPr>
-        <w:t>Si se pierde la red o el sensor, no interprete el último color verde como normalidad actual. Verifique vigencia y use el canal institucional previsto si necesita comunicar una situación.</w:t>
+        <w:t xml:space="preserve">Una </w:t>
+      </w:r>
+      <w:r>
+        <w:rPr>
+          <w:b/>
+        </w:rPr>
+        <w:t>lectura vencida</w:t>
+      </w:r>
+      <w:r>
+        <w:rPr>
+          <w:b w:val="0"/>
+        </w:rPr>
+        <w:t xml:space="preserve"> es un dato guardado que ya es demasiado antiguo para mostrarlo como actual. En el receptor USB ocurre después de más de 10 segundos sin muestra válida. En la nube se permiten hasta 95 segundos porque las mediciones se envían normalmente cada minuto. Por eso las pantallas local y remota pueden actualizarse en momentos diferentes.</w:t>
+      </w:r>
+    </w:p>
+    <w:p>
+      <w:r>
+        <w:rPr>
+          <w:b w:val="0"/>
+        </w:rPr>
+        <w:t>La fecha de un aviso puede ser diferente a la de la lectura actual. En Android puede tocar la antigüedad para ver la fecha exacta. Si una notificación llega con retraso, revise cuándo ocurrió el aviso antes de interpretarlo como una situación nueva.</w:t>
+      </w:r>
+    </w:p>
+    <w:p>
+      <w:r>
+        <w:rPr>
+          <w:b w:val="0"/>
+        </w:rPr>
+        <w:t xml:space="preserve">El DHT mide temperatura y humedad. El MQ135 responde a distintas sustancias y su lectura depende de la alimentación y preparación del sensor. Un valor como 560 ADC no equivale a 560 ppm. La comparación </w:t>
+      </w:r>
+      <w:r>
+        <w:rPr>
+          <w:b/>
+        </w:rPr>
+        <w:t>× referencia</w:t>
+      </w:r>
+      <w:r>
+        <w:rPr>
+          <w:b w:val="0"/>
+        </w:rPr>
+        <w:t xml:space="preserve"> tampoco identifica un gas.</w:t>
+      </w:r>
+    </w:p>
+    <w:p>
+      <w:r>
+        <w:rPr>
+          <w:b w:val="0"/>
+        </w:rPr>
+        <w:t>Si se pierde la conexión o falla el sensor, revise la fecha de los últimos datos. El color que tenía una lectura anterior no describe el estado actual. Para comunicar una situación, use el medio acordado por su institución.</w:t>
       </w:r>
     </w:p>
     <w:p>
@@ -3778,7 +3837,7 @@
         <w:rPr>
           <w:b w:val="0"/>
         </w:rPr>
-        <w:t xml:space="preserve"> registra una decisión humana y la comparte con las personas autorizadas del aula. No modifica una lectura, no normaliza el ambiente y no acredita una acción que usted no haya realizado. La recuperación de los sensores tampoco atiende automáticamente el aviso. Abrir un push no lo atiende.</w:t>
+        <w:t xml:space="preserve"> indica que usted dio por atendido el aviso. Las demás personas del aula verán ese estado cuando actualicen la pantalla. La medición sigue siendo independiente: atender no significa que los valores hayan vuelto a la normalidad. Tampoco se atiende un aviso automáticamente al abrir su notificación o al recuperarse los valores del sensor.</w:t>
       </w:r>
     </w:p>
     <w:p>
@@ -3797,7 +3856,7 @@
         <w:rPr>
           <w:b w:val="0"/>
         </w:rPr>
-        <w:t xml:space="preserve"> abre el selector del dispositivo o copia el texto si esa función no existe. Usted elige el canal y completa el envío. No hay envío automático ni confirmación de comprensión de la otra persona. Los observadores no pueden atender avisos.</w:t>
+        <w:t xml:space="preserve"> permite elegir una aplicación de mensajería u otro medio disponible. Si el navegador no ofrece ese selector, se copia el texto para que usted lo pegue donde corresponda. Debe completar el envío en la aplicación elegida. Compartir no cambia la atención del aviso. Los observadores pueden consultar, pero no atender.</w:t>
       </w:r>
     </w:p>
     <w:p>
@@ -4049,15 +4108,15 @@
         <w:rPr>
           <w:b w:val="0"/>
         </w:rPr>
-        <w:t>La gráfica ayuda a reconocer variaciones. No es una vista de todas las mediciones desde la instalación ni una predicción. El botón obtiene hasta 60 muestras del origen elegido. En una pantalla pequeña puede desplazar la tabla horizontalmente.</w:t>
-      </w:r>
-    </w:p>
-    <w:p>
-      <w:r>
-        <w:rPr>
-          <w:b w:val="0"/>
-        </w:rPr>
-        <w:t>Si cambia aula u origen, vuelva a consultar: el resultado anterior no debe atribuirse al nuevo contexto. Si no hay muestras, revise la selección y si ese origen llegó a registrar datos. La falta de filas no significa que un sensor midiera cero.</w:t>
+        <w:t>La gráfica muestra hasta 60 muestras del origen elegido, no todas las mediciones desde que comenzó a usarse el sistema. En una pantalla pequeña puede desplazar la tabla horizontalmente.</w:t>
+      </w:r>
+    </w:p>
+    <w:p>
+      <w:r>
+        <w:rPr>
+          <w:b w:val="0"/>
+        </w:rPr>
+        <w:t>Si cambia de aula u origen, vuelva a consultar. Si no aparecen filas, revise la selección y compruebe si se registraron datos de ese origen. Una tabla vacía no equivale a una medición de cero.</w:t>
       </w:r>
     </w:p>
     <w:p>
@@ -4073,7 +4132,19 @@
         <w:rPr>
           <w:b w:val="0"/>
         </w:rPr>
-        <w:t>Resultado esperado: puede identificar qué variable y origen está consultando y a qué fecha corresponden los valores. Para conocer el estado actual, vuelva a Mis aulas y compruebe su vigencia.</w:t>
+        <w:t xml:space="preserve">Compruebe la variable, el origen y las fechas antes de interpretar la gráfica. Para conocer la última lectura disponible, vuelva a </w:t>
+      </w:r>
+      <w:r>
+        <w:rPr>
+          <w:b/>
+        </w:rPr>
+        <w:t>Mis aulas</w:t>
+      </w:r>
+      <w:r>
+        <w:rPr>
+          <w:b w:val="0"/>
+        </w:rPr>
+        <w:t>.</w:t>
       </w:r>
     </w:p>
     <w:p>
@@ -4086,7 +4157,7 @@
         <w:pStyle w:val="Heading1"/>
       </w:pPr>
       <w:r>
-        <w:t>11 Instalar o actualizar Android</w:t>
+        <w:t>11 Instalar o actualizar la app Android</w:t>
       </w:r>
       <w:bookmarkStart w:id="12" w:name="cap_12"/>
       <w:bookmarkEnd w:id="12"/>
@@ -4112,7 +4183,7 @@
         <w:rPr>
           <w:b w:val="0"/>
         </w:rPr>
-        <w:t>, disponible en la carpeta Entregas de esta instalación. Al verificar esta edición todavía no había un release público 0.8.2. Si se publica después, compruebe nombre, procedencia y versión antes de descargarlo.</w:t>
+        <w:t>, disponible en la carpeta Entregas del proyecto. Al preparar esta edición, ese archivo aún no estaba publicado en la página de descargas. Si se publica después, compruebe su nombre y versión.</w:t>
       </w:r>
     </w:p>
     <w:p>
@@ -4124,7 +4195,7 @@
         <w:rPr>
           <w:b w:val="0"/>
         </w:rPr>
-        <w:t>2. Abra el APK en el teléfono. Si Android lo solicita, permita a esa aplicación de origen instalar el archivo. El nombre y la ruta del permiso dependen del fabricante.</w:t>
+        <w:t>2. Abra el APK en el teléfono. Si Android lo solicita, autorice al navegador o gestor de archivos que está usando a instalar esa app. La ubicación de este permiso depende del modelo de teléfono.</w:t>
       </w:r>
     </w:p>
     <w:p>
@@ -4244,15 +4315,15 @@
         <w:rPr>
           <w:b w:val="0"/>
         </w:rPr>
-        <w:t>La conexión USB del teléfono no es necesaria para instalar por Wi-Fi. Para consultar y recibir avisos cloud, no es necesario que el teléfono permanezca en la red de la PC: necesita internet y acceso al servicio.</w:t>
-      </w:r>
-    </w:p>
-    <w:p>
-      <w:r>
-        <w:rPr>
-          <w:b w:val="0"/>
-        </w:rPr>
-        <w:t>Si Android indica incompatibilidad de firma, no desinstale de inmediato. Solicite revisión del archivo y de la instalación anterior: borrar datos o desinstalar elimina el archivo personal de avisos. Android 0.8.2 sigue siendo una APK piloto; su aceptación física en el Samsung A02 está pendiente en las evidencias de esta edición.</w:t>
+        <w:t>No necesita conectar el teléfono por USB para instalar por Wi-Fi. Una vez instalada y registrada la app, el teléfono puede recibir avisos fuera de esa red siempre que tenga internet.</w:t>
+      </w:r>
+    </w:p>
+    <w:p>
+      <w:r>
+        <w:rPr>
+          <w:b w:val="0"/>
+        </w:rPr>
+        <w:t>Si Android indica que no puede actualizar por una firma incompatible, solicite al responsable que revise el archivo. Evite desinstalar como primera solución, porque perdería el archivo personal de avisos. La versión 0.8.2 fue revisada en un emulador; todavía falta comprobar esta versión en el Samsung A02 usado por el proyecto.</w:t>
       </w:r>
     </w:p>
     <w:p>
@@ -4324,7 +4395,7 @@
         <w:drawing>
           <wp:inline xmlns:a="http://schemas.openxmlformats.org/drawingml/2006/main" xmlns:pic="http://schemas.openxmlformats.org/drawingml/2006/picture">
             <wp:extent cx="1604772" cy="3566160"/>
-            <wp:docPr id="8" name="Picture 8" descr="Mi aula en Android 0.8.2. Captura nativa de demostración en emulador, con lectura sintética."/>
+            <wp:docPr id="8" name="Picture 8" descr="Mi aula en Android 0.8.2, con datos de ejemplo. Captura de emulador."/>
             <wp:cNvGraphicFramePr>
               <a:graphicFrameLocks noChangeAspect="1"/>
             </wp:cNvGraphicFramePr>
@@ -4360,7 +4431,7 @@
         <w:pStyle w:val="Caption"/>
       </w:pPr>
       <w:r>
-        <w:t>Mi aula en Android 0.8.2. Captura nativa de demostración en emulador, con lectura sintética.</w:t>
+        <w:t>Mi aula en Android 0.8.2, con datos de ejemplo. Captura de emulador.</w:t>
       </w:r>
     </w:p>
     <w:p>
@@ -4468,7 +4539,7 @@
         <w:rPr>
           <w:b w:val="0"/>
         </w:rPr>
-        <w:t xml:space="preserve"> para solicitar una comprobación y </w:t>
+        <w:t xml:space="preserve"> para consultar los datos de nuevo y </w:t>
       </w:r>
       <w:r>
         <w:rPr>
@@ -4480,15 +4551,15 @@
         <w:rPr>
           <w:b w:val="0"/>
         </w:rPr>
-        <w:t xml:space="preserve"> para ir a la atención pendiente.</w:t>
-      </w:r>
-    </w:p>
-    <w:p>
-      <w:r>
-        <w:rPr>
-          <w:b w:val="0"/>
-        </w:rPr>
-        <w:t>Si la lectura vence, consulte los datos históricos solo como diagnóstico. Actualizar la pantalla no vuelve a medir el ambiente: la nueva muestra debe llegar desde la maqueta y la PC. Si el teléfono está sin red, no puede acreditar una actualización cloud.</w:t>
+        <w:t xml:space="preserve"> para abrir el aviso pendiente.</w:t>
+      </w:r>
+    </w:p>
+    <w:p>
+      <w:r>
+        <w:rPr>
+          <w:b w:val="0"/>
+        </w:rPr>
+        <w:t>Si la lectura está vencida, los valores que ve corresponden a otro momento. Pulsar Actualizar no hace que el sensor mida otra vez: la nueva muestra debe llegar desde la maqueta y la PC. El teléfono necesita internet para consultar esos datos.</w:t>
       </w:r>
     </w:p>
     <w:p>
@@ -4527,7 +4598,7 @@
         <w:rPr>
           <w:b w:val="0"/>
         </w:rPr>
-        <w:t>. Una notificación legítima dirige al aviso correspondiente cuando su sesión conserva acceso.</w:t>
+        <w:t>. Si sigue conectado con una cuenta autorizada, la notificación abre el aviso correspondiente.</w:t>
       </w:r>
     </w:p>
     <w:p>
@@ -4587,7 +4658,7 @@
         <w:rPr>
           <w:b w:val="0"/>
         </w:rPr>
-        <w:t>3. Compruebe fecha, aula, origen y lectura asociada. Es la lectura histórica que originó o elevó el aviso, no el valor actual del ambiente.</w:t>
+        <w:t>3. Compruebe fecha, aula, origen y lectura asociada. Esa lectura se guardó cuando se creó el aviso o cuando pasó a un nivel de mayor alerta. Para conocer la lectura más reciente, consulte Mi aula.</w:t>
       </w:r>
     </w:p>
     <w:p>
@@ -4635,7 +4706,7 @@
         <w:rPr>
           <w:b w:val="0"/>
         </w:rPr>
-        <w:t>5. Espere la confirmación. La atención compartida se refleja en los clientes que actualicen ese aviso.</w:t>
+        <w:t>5. Espere la confirmación. Las demás personas del aula verán el aviso atendido cuando actualicen la pantalla.</w:t>
       </w:r>
     </w:p>
     <w:p>
@@ -4704,7 +4775,7 @@
         <w:rPr>
           <w:b w:val="0"/>
         </w:rPr>
-        <w:t xml:space="preserve">. No se rellenan con la lectura de otro momento. </w:t>
+        <w:t xml:space="preserve">: no se guardó la medición que los originó. En </w:t>
       </w:r>
       <w:r>
         <w:rPr>
@@ -4716,7 +4787,7 @@
         <w:rPr>
           <w:b w:val="0"/>
         </w:rPr>
-        <w:t xml:space="preserve"> permite diferenciar lo que se sabe del envío y del teléfono.</w:t>
+        <w:t xml:space="preserve"> puede revisar si se aceptó el envío, si llegó a la app y si se abrió.</w:t>
       </w:r>
     </w:p>
     <w:p>
@@ -4793,7 +4864,7 @@
         <w:rPr>
           <w:b w:val="0"/>
         </w:rPr>
-        <w:t xml:space="preserve"> representan el estado compartido del incidente. </w:t>
+        <w:t xml:space="preserve"> muestran el estado del aviso que comparten las personas del aula. </w:t>
       </w:r>
       <w:r>
         <w:rPr>
@@ -4805,7 +4876,7 @@
         <w:rPr>
           <w:b w:val="0"/>
         </w:rPr>
-        <w:t xml:space="preserve"> es una organización personal de esa cuenta en ese teléfono. Son funciones diferentes.</w:t>
+        <w:t xml:space="preserve"> solo organiza su propia bandeja en ese teléfono.</w:t>
       </w:r>
     </w:p>
     <w:p>
@@ -4901,7 +4972,7 @@
         <w:rPr>
           <w:b w:val="0"/>
         </w:rPr>
-        <w:t>. Volverá a Pendientes o Atendidos según el estado compartido vigente.</w:t>
+        <w:t>. Volverá a Pendientes si aún no se atendió, o a Atendidos si alguien ya lo atendió.</w:t>
       </w:r>
     </w:p>
     <w:p>
@@ -4914,7 +4985,7 @@
         <w:drawing>
           <wp:inline xmlns:a="http://schemas.openxmlformats.org/drawingml/2006/main" xmlns:pic="http://schemas.openxmlformats.org/drawingml/2006/picture">
             <wp:extent cx="1522476" cy="3383280"/>
-            <wp:docPr id="10" name="Picture 10" descr="Archivo personal Android con un aviso aún pendiente. Ejemplo en emulador, sin cambios cloud."/>
+            <wp:docPr id="10" name="Picture 10" descr="Archivo personal con un aviso que sigue pendiente. Ejemplo en emulador."/>
             <wp:cNvGraphicFramePr>
               <a:graphicFrameLocks noChangeAspect="1"/>
             </wp:cNvGraphicFramePr>
@@ -4950,31 +5021,31 @@
         <w:pStyle w:val="Caption"/>
       </w:pPr>
       <w:r>
-        <w:t>Archivo personal Android con un aviso aún pendiente. Ejemplo en emulador, sin cambios cloud.</w:t>
-      </w:r>
-    </w:p>
-    <w:p>
-      <w:r>
-        <w:rPr>
-          <w:b w:val="0"/>
-        </w:rPr>
-        <w:t>Archivar no elimina el incidente, no detiene notificaciones, no modifica lo que ve otra persona y no acredita atención. Antes de archivar una situación pendiente, compruebe que no está confundiendo orden de bandeja con respuesta al aviso.</w:t>
-      </w:r>
-    </w:p>
-    <w:p>
-      <w:r>
-        <w:rPr>
-          <w:b w:val="0"/>
-        </w:rPr>
-        <w:t>El archivo no se sincroniza entre teléfonos. Se conserva al actualizar sobre una APK compatible y al volver a entrar con la misma cuenta en ese dispositivo. Borrar datos o desinstalar la aplicación lo elimina. Su límite local es de 500 identificadores.</w:t>
-      </w:r>
-    </w:p>
-    <w:p>
-      <w:r>
-        <w:rPr>
-          <w:b w:val="0"/>
-        </w:rPr>
-        <w:t>La bandeja organiza los avisos recientes que entrega el portal, hasta 30. No es una descarga ilimitada de todo el historial institucional. Si necesita revisar un evento que no aparece, consulte al administrador y los registros disponibles.</w:t>
+        <w:t>Archivo personal con un aviso que sigue pendiente. Ejemplo en emulador.</w:t>
+      </w:r>
+    </w:p>
+    <w:p>
+      <w:r>
+        <w:rPr>
+          <w:b w:val="0"/>
+        </w:rPr>
+        <w:t>Archivar aparta el aviso de su bandeja, pero no lo marca como atendido, no lo elimina para otras personas ni cancela otros envíos. Si el aviso requiere una respuesta, atiéndalo antes de archivarlo.</w:t>
+      </w:r>
+    </w:p>
+    <w:p>
+      <w:r>
+        <w:rPr>
+          <w:b w:val="0"/>
+        </w:rPr>
+        <w:t>El archivo no se comparte entre teléfonos. Se conserva al actualizar la app con una versión compatible y al volver a entrar con la misma cuenta en ese dispositivo. Borrar los datos o desinstalar la aplicación elimina esa organización personal. Puede guardar hasta 500 referencias de avisos.</w:t>
+      </w:r>
+    </w:p>
+    <w:p>
+      <w:r>
+        <w:rPr>
+          <w:b w:val="0"/>
+        </w:rPr>
+        <w:t>La bandeja recibe hasta 30 avisos recientes del aula. No muestra todo el historial desde la instalación. Si necesita buscar un aviso más antiguo que no aparece, consulte al administrador.</w:t>
       </w:r>
     </w:p>
     <w:p>
@@ -5307,7 +5378,7 @@
         <w:pStyle w:val="Heading1"/>
       </w:pPr>
       <w:r>
-        <w:t>16 Administrar aulas y sus datos</w:t>
+        <w:t>16 Crear y editar aulas</w:t>
       </w:r>
       <w:bookmarkStart w:id="17" w:name="cap_17"/>
       <w:bookmarkEnd w:id="17"/>
@@ -5317,7 +5388,7 @@
         <w:rPr>
           <w:b w:val="0"/>
         </w:rPr>
-        <w:t>Este apartado corresponde a personas con autorización administrativa. Si no aparece en el menú, no intente habilitarlo mediante claves técnicas: solicite revisión del permiso.</w:t>
+        <w:t>Este apartado requiere permiso de administrador. Si no aparece en el menú y necesita usarlo, solicite que el responsable revise su acceso.</w:t>
       </w:r>
     </w:p>
     <w:p>
@@ -5449,7 +5520,7 @@
         <w:rPr>
           <w:b w:val="0"/>
         </w:rPr>
-        <w:t xml:space="preserve">4. Si su cuenta tiene capacidad institucional, use </w:t>
+        <w:t xml:space="preserve">4. Si su cuenta tiene permiso para crear aulas, use </w:t>
       </w:r>
       <w:r>
         <w:rPr>
@@ -5461,7 +5532,7 @@
         <w:rPr>
           <w:b w:val="0"/>
         </w:rPr>
-        <w:t xml:space="preserve">, complete nombre e institución opcional y pulse </w:t>
+        <w:t xml:space="preserve">, complete el nombre y, si lo desea, la institución. Pulse </w:t>
       </w:r>
       <w:r>
         <w:rPr>
@@ -5473,7 +5544,7 @@
         <w:rPr>
           <w:b w:val="0"/>
         </w:rPr>
-        <w:t>. El nombre admite de 2 a 100 caracteres; la institución hasta 120.</w:t>
+        <w:t>. El nombre admite de 2 a 100 caracteres; la institución, hasta 120.</w:t>
       </w:r>
     </w:p>
     <w:p>
@@ -5562,7 +5633,7 @@
         <w:rPr>
           <w:b w:val="0"/>
         </w:rPr>
-        <w:t xml:space="preserve">Crear un aula no crea su montaje físico ni registra teléfonos automáticamente. Para dejarla operativa, revise personas autorizadas, PC vinculada si adquirirá sensores, reglas y registro de cada teléfono. Si falta </w:t>
+        <w:t xml:space="preserve">Después de crear un aula, agregue a las personas que tendrán acceso. Si conectará una maqueta, vincule su PC y revise las reglas. Cada persona debe registrar su teléfono desde Android. Si </w:t>
       </w:r>
       <w:r>
         <w:rPr>
@@ -5574,7 +5645,7 @@
         <w:rPr>
           <w:b w:val="0"/>
         </w:rPr>
-        <w:t>, puede deberse a la capacidad institucional o a una guarda; no se resuelve contratando un plan.</w:t>
+        <w:t xml:space="preserve"> no está disponible, puede faltar el permiso necesario o haberse alcanzado un límite del sistema; consulte al responsable.</w:t>
       </w:r>
     </w:p>
     <w:p>
@@ -5826,7 +5897,7 @@
         <w:rPr>
           <w:b w:val="0"/>
         </w:rPr>
-        <w:t xml:space="preserve">No publique ni proyecte una invitación: el enlace es una credencial de alta y solo se muestra al generarlo. La persona nueva define su contraseña; una cuenta existente mantiene la suya. También puede usar </w:t>
+        <w:t xml:space="preserve">Comparta la invitación solo con su destinatario: quien tenga el enlace podría intentar activar esa cuenta. El enlace se muestra una sola vez al crearlo. La persona nueva define su contraseña; una cuenta existente mantiene la suya. Para agregar una cuenta ya creada, también puede usar </w:t>
       </w:r>
       <w:r>
         <w:rPr>
@@ -5838,7 +5909,7 @@
         <w:rPr>
           <w:b w:val="0"/>
         </w:rPr>
-        <w:t xml:space="preserve">, indicar correo y rol y pulsar </w:t>
+        <w:t xml:space="preserve">, indicar correo y permiso y pulsar </w:t>
       </w:r>
       <w:r>
         <w:rPr>
@@ -5894,7 +5965,7 @@
         <w:rPr>
           <w:b w:val="0"/>
         </w:rPr>
-        <w:t xml:space="preserve"> retira la membresía de esa aula; conserva la cuenta e historial. La lista protege al propietario y a la cuenta actual frente a ciertas modificaciones. Revise antes el destinatario y el aula.</w:t>
+        <w:t xml:space="preserve"> impide que esa persona siga consultando el aula; conserva su cuenta y los registros anteriores. Algunas acciones no están disponibles sobre el propietario del aula o sobre su propia cuenta. Compruebe el correo y el aula antes de confirmar.</w:t>
       </w:r>
     </w:p>
     <w:p>
@@ -5914,7 +5985,7 @@
         <w:rPr>
           <w:b w:val="0"/>
         </w:rPr>
-        <w:t xml:space="preserve">, actualice la lista y use </w:t>
+        <w:t xml:space="preserve">, use </w:t>
       </w:r>
       <w:r>
         <w:rPr>
@@ -5926,7 +5997,7 @@
         <w:rPr>
           <w:b w:val="0"/>
         </w:rPr>
-        <w:t xml:space="preserve"> sobre una pendiente si ya no corresponde. Revocar una invitación y retirar una membresía aceptada son acciones distintas. Hay límites preventivos: 10 lugares por aula incluyendo invitaciones vigentes y 10 invitaciones globales por 24 horas. Si se alcanza un límite, revise el uso y comuníquese con el responsable.</w:t>
+        <w:t xml:space="preserve"> si una invitación pendiente ya no debe utilizarse. Si la persona ya aceptó, debe revisar su acceso en la lista de Personas. Se permiten 10 lugares por aula contando las invitaciones pendientes que no vencieron, y 10 invitaciones en todo el proyecto por cada 24 horas. Si se alcanza un límite, revise la lista con el responsable.</w:t>
       </w:r>
     </w:p>
     <w:p>
@@ -6021,7 +6092,7 @@
         <w:rPr>
           <w:b w:val="0"/>
         </w:rPr>
-        <w:t xml:space="preserve">3. En la PC que tendrá la placa, use </w:t>
+        <w:t xml:space="preserve">3. Desde la PC conectada al Arduino, use </w:t>
       </w:r>
       <w:r>
         <w:rPr>
@@ -6033,7 +6104,7 @@
         <w:rPr>
           <w:b w:val="0"/>
         </w:rPr>
-        <w:t xml:space="preserve"> y siga la asignación automática del capítulo 19.</w:t>
+        <w:t xml:space="preserve"> y siga los pasos del capítulo 19 para asignarle un aula.</w:t>
       </w:r>
     </w:p>
     <w:p>
@@ -6158,7 +6229,7 @@
         <w:rPr>
           <w:b w:val="0"/>
         </w:rPr>
-        <w:t xml:space="preserve"> genera configuración privada. Su manejo corresponde al responsable técnico y se utiliza únicamente en la PC prevista. No la envíe por un grupo ni la copie a Android. Para el primer uso común, prefiera la asignación automática y evite manipular archivos de secretos.</w:t>
+        <w:t xml:space="preserve"> genera un archivo privado para autorizar a esa PC. Pida al responsable técnico que lo configure; no lo comparta en un grupo ni lo copie a Android. Para el primer uso, siga la asignación automática del capítulo 19.</w:t>
       </w:r>
     </w:p>
     <w:p>
@@ -6171,7 +6242,7 @@
         <w:pStyle w:val="Heading1"/>
       </w:pPr>
       <w:r>
-        <w:t>19 Asignar esta PC y conectar Arduino</w:t>
+        <w:t>19 Vincular la PC y conectar Arduino</w:t>
       </w:r>
       <w:bookmarkStart w:id="20" w:name="cap_20"/>
       <w:bookmarkEnd w:id="20"/>
@@ -6181,7 +6252,19 @@
         <w:rPr>
           <w:b w:val="0"/>
         </w:rPr>
-        <w:t>Debe realizarse desde el portal local abierto por el panel en la PC físicamente conectada a la maqueta. El portal público orienta al panel instalado; no controla su USB directamente.</w:t>
+        <w:t xml:space="preserve">Realice estos pasos en la PC conectada a la maqueta. Abra el portal desde </w:t>
+      </w:r>
+      <w:r>
+        <w:rPr>
+          <w:b/>
+        </w:rPr>
+        <w:t>Panel SFA Aire.exe</w:t>
+      </w:r>
+      <w:r>
+        <w:rPr>
+          <w:b w:val="0"/>
+        </w:rPr>
+        <w:t>, no desde la dirección pública de internet, que solo muestra la orientación para usar el panel local.</w:t>
       </w:r>
     </w:p>
     <w:p>
@@ -6313,7 +6396,7 @@
         <w:rPr>
           <w:b w:val="0"/>
         </w:rPr>
-        <w:t>. El receptor usa 115200 baudios y solicita MONITOR al firmware.</w:t>
+        <w:t>. El receptor se comunica a 115200 baudios y envía el comando MONITOR al programa cargado en Arduino para que empiece a transmitir.</w:t>
       </w:r>
     </w:p>
     <w:p>
@@ -6325,7 +6408,7 @@
         <w:rPr>
           <w:b w:val="0"/>
         </w:rPr>
-        <w:t xml:space="preserve">6. Compruebe </w:t>
+        <w:t xml:space="preserve">6. En </w:t>
       </w:r>
       <w:r>
         <w:rPr>
@@ -6337,7 +6420,7 @@
         <w:rPr>
           <w:b w:val="0"/>
         </w:rPr>
-        <w:t>, antigüedad, origen y estado de nube. Confirme después las muestras en Mis aulas y Android.</w:t>
+        <w:t>, compruebe que llegan valores y que la hora se actualiza. Revise también si hay envíos pendientes a la nube. Después consulte esas mediciones en Mis aulas y Android.</w:t>
       </w:r>
     </w:p>
     <w:p>
@@ -6350,7 +6433,7 @@
         <w:drawing>
           <wp:inline xmlns:a="http://schemas.openxmlformats.org/drawingml/2006/main" xmlns:pic="http://schemas.openxmlformats.org/drawingml/2006/picture">
             <wp:extent cx="3742302" cy="2468880"/>
-            <wp:docPr id="15" name="Picture 15" descr="Primera asignación en prueba de interfaz. No acredita una placa física conectada."/>
+            <wp:docPr id="15" name="Picture 15" descr="Pantalla de asignación de una PC a un aula. Ejemplo sin Arduino conectado."/>
             <wp:cNvGraphicFramePr>
               <a:graphicFrameLocks noChangeAspect="1"/>
             </wp:cNvGraphicFramePr>
@@ -6386,58 +6469,47 @@
         <w:pStyle w:val="Caption"/>
       </w:pPr>
       <w:r>
-        <w:t>Primera asignación en prueba de interfaz. No acredita una placa física conectada.</w:t>
-      </w:r>
-    </w:p>
-    <w:p>
-      <w:r>
-        <w:rPr>
-          <w:b w:val="0"/>
-        </w:rPr>
+        <w:t>Pantalla de asignación de una PC a un aula. Ejemplo sin Arduino conectado.</w:t>
+      </w:r>
+    </w:p>
+    <w:p>
+      <w:r>
+        <w:rPr>
+          <w:b w:val="0"/>
+        </w:rPr>
+        <w:t xml:space="preserve">Un puerto abierto puede no estar recibiendo datos. Use </w:t>
       </w:r>
       <w:r>
         <w:rPr>
           <w:b/>
         </w:rPr>
-        <w:t>Puerto abierto</w:t>
-      </w:r>
-      <w:r>
-        <w:rPr>
-          <w:b w:val="0"/>
-        </w:rPr>
-        <w:t xml:space="preserve"> no equivale a lectura válida. Use </w:t>
+        <w:t>Comprobar conexión</w:t>
+      </w:r>
+      <w:r>
+        <w:rPr>
+          <w:b w:val="0"/>
+        </w:rPr>
+        <w:t xml:space="preserve"> y revise los valores. </w:t>
       </w:r>
       <w:r>
         <w:rPr>
           <w:b/>
         </w:rPr>
-        <w:t>Comprobar conexión</w:t>
-      </w:r>
-      <w:r>
-        <w:rPr>
-          <w:b w:val="0"/>
-        </w:rPr>
-        <w:t xml:space="preserve"> si necesita verificar. </w:t>
-      </w:r>
-      <w:r>
-        <w:rPr>
-          <w:b/>
-        </w:rPr>
         <w:t>Detener lectura</w:t>
       </w:r>
       <w:r>
         <w:rPr>
           <w:b w:val="0"/>
         </w:rPr>
-        <w:t xml:space="preserve"> envía PARAR y detiene la adquisición. Si solo aparecen puertos Bluetooth, todavía no se detectó la placa USB.</w:t>
-      </w:r>
-    </w:p>
-    <w:p>
-      <w:r>
-        <w:rPr>
-          <w:b w:val="0"/>
-        </w:rPr>
-        <w:t>Cambiar el selector de aula no reasigna la PC automáticamente. El cambio exige administrar origen y destino, detener lectura o prueba y sincronizar los paquetes pendientes. La asignación conserva historial: los avisos anteriores no se trasladan al aula nueva.</w:t>
+        <w:t xml:space="preserve"> envía el comando PARAR para dejar de recibir mediciones. Si solo aparecen puertos Bluetooth, la PC todavía no detectó la placa USB.</w:t>
+      </w:r>
+    </w:p>
+    <w:p>
+      <w:r>
+        <w:rPr>
+          <w:b w:val="0"/>
+        </w:rPr>
+        <w:t>Cambiar el selector de aula no cambia automáticamente el aula de la PC. Para reasignarla necesita administrar ambas aulas, detener la lectura o la prueba y esperar a que no queden envíos pendientes. Los datos y avisos anteriores siguen perteneciendo al aula donde se registraron.</w:t>
       </w:r>
     </w:p>
     <w:p>
@@ -6460,7 +6532,7 @@
         <w:rPr>
           <w:b w:val="0"/>
         </w:rPr>
-        <w:t>Este capítulo permite reconocer el montaje previsto. El responsable técnico debe confirmar la placa, el módulo, la alimentación y el firmware antes de conectar o cambiar cables. Haga modificaciones con el equipo desconectado de la alimentación.</w:t>
+        <w:t>El responsable técnico debe revisar la placa, los sensores, la alimentación y el programa cargado en Arduino, llamado firmware. Desconecte la alimentación antes de cambiar cables.</w:t>
       </w:r>
     </w:p>
     <w:tbl>
@@ -6579,7 +6651,7 @@
                 <w:color w:val="000000"/>
                 <w:sz w:val="19"/>
               </w:rPr>
-              <w:t>Arduino D2. DHT22 por defecto; DHT11 requiere variante de firmware.</w:t>
+              <w:t>Arduino D2. El programa está preparado para DHT22; debe adaptarse si usa DHT11.</w:t>
             </w:r>
           </w:p>
         </w:tc>
@@ -6634,7 +6706,7 @@
                 <w:color w:val="000000"/>
                 <w:sz w:val="19"/>
               </w:rPr>
-              <w:t>Alimentación admitida por el módulo y GND común. Un DHT sin placa puede necesitar pull-up.</w:t>
+              <w:t>Alimentación admitida por el módulo y GND común. Un DHT sin placa puede necesitar una resistencia adicional; consulte al responsable.</w:t>
             </w:r>
           </w:p>
         </w:tc>
@@ -6898,15 +6970,15 @@
         <w:rPr>
           <w:b w:val="0"/>
         </w:rPr>
-        <w:t>La espera inicial de 180 segundos no sustituye el acondicionamiento del MQ135. Respete la ficha del módulo; la documentación del componente citado por el proyecto contempla más de 48 horas en sus condiciones de ensayo. Registre la estabilidad real antes de definir referencia.</w:t>
-      </w:r>
-    </w:p>
-    <w:p>
-      <w:r>
-        <w:rPr>
-          <w:b w:val="0"/>
-        </w:rPr>
-        <w:t>Para aprender el recorrido use primero simulación. No genere humo, combustión ni gases peligrosos dentro del aula para probar una alerta. La validación física del montaje permanece separada de las capturas y pruebas de software de este manual.</w:t>
+        <w:t>El acondicionamiento del MQ135 es su preparación y estabilización antes de usarlo como referencia. La espera inicial de 180 segundos del programa no lo sustituye. La documentación técnica citada por el proyecto contempla más de 48 horas en sus condiciones de ensayo; el responsable debe consultar la ficha del módulo instalado y comprobar su estabilidad.</w:t>
+      </w:r>
+    </w:p>
+    <w:p>
+      <w:r>
+        <w:rPr>
+          <w:b w:val="0"/>
+        </w:rPr>
+        <w:t>Para aprender a usar el sistema, empiece con la simulación. No genere humo, combustión ni gases peligrosos dentro del aula para probar una alerta. Las capturas del manual no reemplazan la revisión del montaje.</w:t>
       </w:r>
     </w:p>
     <w:p>
@@ -6929,7 +7001,7 @@
         <w:rPr>
           <w:b w:val="0"/>
         </w:rPr>
-        <w:t>Solo el administrador autorizado debe modificar las reglas, desde la PC asignada y con conexión verificada. Registre los valores anteriores y el motivo para poder revisar los cambios.</w:t>
+        <w:t>Las reglas se modifican con una cuenta administradora, desde la PC asignada al aula y conectada al sistema. Anote los valores anteriores y el motivo del cambio antes de guardar.</w:t>
       </w:r>
     </w:p>
     <w:p>
@@ -6989,7 +7061,7 @@
         <w:rPr>
           <w:b w:val="0"/>
         </w:rPr>
-        <w:t>, introduzca la referencia medida y documentada del montaje. El valor 300 del simulador no es una referencia universal.</w:t>
+        <w:t>, introduzca el valor obtenido al medir el sensor ya estabilizado en el entorno de referencia acordado. El valor 300 que usa el simulador no sirve como referencia para cualquier sensor.</w:t>
       </w:r>
     </w:p>
     <w:p>
@@ -7192,7 +7264,7 @@
                 <w:color w:val="000000"/>
                 <w:sz w:val="19"/>
               </w:rPr>
-              <w:t>Comparación del ADC con su referencia; alerta debe representar el nivel superior previsto.</w:t>
+              <w:t>Niveles de comparación con la referencia. El nivel de alerta debe ser mayor que el de aviso.</w:t>
             </w:r>
           </w:p>
         </w:tc>
@@ -7247,7 +7319,7 @@
                 <w:color w:val="000000"/>
                 <w:sz w:val="19"/>
               </w:rPr>
-              <w:t>Tiempo de variación válida sostenida antes de confirmar el aviso.</w:t>
+              <w:t>Cuánto tiempo debe mantenerse la variación para generar el aviso.</w:t>
             </w:r>
           </w:p>
         </w:tc>
@@ -7302,7 +7374,7 @@
                 <w:color w:val="000000"/>
                 <w:sz w:val="19"/>
               </w:rPr>
-              <w:t>Tiempo necesario para confirmar recuperación de lectura. No atiende el aviso.</w:t>
+              <w:t>Cuánto tiempo deben mantenerse los valores de recuperación para cambiar el estado de la lectura. El aviso sigue pendiente hasta que alguien lo atienda.</w:t>
             </w:r>
           </w:p>
         </w:tc>
@@ -7357,7 +7429,7 @@
                 <w:color w:val="000000"/>
                 <w:sz w:val="19"/>
               </w:rPr>
-              <w:t>Margen que evita alternar continuamente de estado cerca del umbral.</w:t>
+              <w:t>Margen de retorno que evita que el estado cambie continuamente cuando la lectura está cerca del umbral.</w:t>
             </w:r>
           </w:p>
         </w:tc>
@@ -7412,7 +7484,7 @@
                 <w:color w:val="000000"/>
                 <w:sz w:val="19"/>
               </w:rPr>
-              <w:t>Habilita comparación de temperatura válida con niveles e histéresis configurados.</w:t>
+              <w:t>Permite definir los niveles de aviso y alerta por temperatura.</w:t>
             </w:r>
           </w:p>
         </w:tc>
@@ -7428,15 +7500,15 @@
         <w:rPr>
           <w:b w:val="0"/>
         </w:rPr>
-        <w:t>Los valores de demostración incluyen aviso 1,30 ×, alerta 1,60 ×, persistencia 12 s, recuperación 20 s e histéresis relativa 0,10. No son límites sanitarios. Confirme las reglas efectivas de su instalación; no las reemplace solo por coincidir con una captura.</w:t>
-      </w:r>
-    </w:p>
-    <w:p>
-      <w:r>
-        <w:rPr>
-          <w:b w:val="0"/>
-        </w:rPr>
-        <w:t>Si aparece un conflicto al guardar, descarte o revise los cambios y vuelva a consultar el estado. No declare que el sensor está acondicionado para eliminar un bloqueo. Un fallo DHT, saturación, pérdida de datos o falta de referencia puede impedir una confirmación válida.</w:t>
+        <w:t>Los valores de demostración incluyen aviso 1,30 ×, alerta 1,60 ×, persistencia 12 s, recuperación 20 s e histéresis relativa 0,10. Por ejemplo, con una referencia de 300 ADC, 1,30 × corresponde a 390 ADC y 1,60 × a 480 ADC. Estos números explican el cálculo; no son límites sanitarios ni valores para copiar en cualquier montaje.</w:t>
+      </w:r>
+    </w:p>
+    <w:p>
+      <w:r>
+        <w:rPr>
+          <w:b w:val="0"/>
+        </w:rPr>
+        <w:t>Si el sistema informa que las reglas cambiaron mientras editaba, consulte las reglas guardadas antes de reintentar. No marque el sensor como acondicionado solo para quitar un bloqueo. Un fallo del DHT, una señal fuera de rango, la pérdida de datos o la falta de referencia pueden impedir que se confirme un aviso.</w:t>
       </w:r>
     </w:p>
     <w:p>
@@ -7459,7 +7531,7 @@
         <w:rPr>
           <w:b w:val="0"/>
         </w:rPr>
-        <w:t>La prueba rápida comprueba el recorrido de avisos sin Arduino ni receptor PC. Requiere una sesión administradora del aula, un teléfono registrado para esa aula y consentimiento para recibir simulaciones.</w:t>
+        <w:t>La prueba rápida permite comprobar si un aviso llega al teléfono sin conectar Arduino ni iniciar el receptor de la PC. Necesita una cuenta administradora del aula y un teléfono registrado que tenga habilitada la recepción de simulaciones.</w:t>
       </w:r>
     </w:p>
     <w:p>
@@ -7531,7 +7603,7 @@
         <w:rPr>
           <w:b w:val="0"/>
         </w:rPr>
-        <w:t>, revise los teléfonos habilitados y el margen de entregas.</w:t>
+        <w:t>, revise los teléfonos habilitados y cuántas notificaciones quedan disponibles.</w:t>
       </w:r>
     </w:p>
     <w:p>
@@ -7555,7 +7627,7 @@
         <w:rPr>
           <w:b w:val="0"/>
         </w:rPr>
-        <w:t xml:space="preserve"> y elija Temperatura, MQ135 o Ambos. Los valores son sintéticos.</w:t>
+        <w:t xml:space="preserve"> y elija Temperatura, MQ135 o Ambos. Son valores de ejemplo, no lecturas del sensor.</w:t>
       </w:r>
     </w:p>
     <w:p>
@@ -7579,7 +7651,7 @@
         <w:rPr>
           <w:b w:val="0"/>
         </w:rPr>
-        <w:t>. Observe la traza y compruebe el teléfono.</w:t>
+        <w:t>. Revise el detalle del envío y compruebe el teléfono.</w:t>
       </w:r>
     </w:p>
     <w:p>
@@ -7648,7 +7720,7 @@
         <w:rPr>
           <w:b w:val="0"/>
         </w:rPr>
-        <w:t xml:space="preserve">El resultado progresa por </w:t>
+        <w:t xml:space="preserve">El detalle distingue cuatro etapas: </w:t>
       </w:r>
       <w:r>
         <w:rPr>
@@ -7660,7 +7732,7 @@
         <w:rPr>
           <w:b w:val="0"/>
         </w:rPr>
-        <w:t xml:space="preserve">, </w:t>
+        <w:t xml:space="preserve"> significa que se preparó el envío; </w:t>
       </w:r>
       <w:r>
         <w:rPr>
@@ -7672,7 +7744,7 @@
         <w:rPr>
           <w:b w:val="0"/>
         </w:rPr>
-        <w:t xml:space="preserve">, </w:t>
+        <w:t xml:space="preserve">, que Firebase lo aceptó; </w:t>
       </w:r>
       <w:r>
         <w:rPr>
@@ -7684,7 +7756,7 @@
         <w:rPr>
           <w:b w:val="0"/>
         </w:rPr>
-        <w:t xml:space="preserve"> y </w:t>
+        <w:t xml:space="preserve">, que la aplicación confirmó su llegada; </w:t>
       </w:r>
       <w:r>
         <w:rPr>
@@ -7696,15 +7768,15 @@
         <w:rPr>
           <w:b w:val="0"/>
         </w:rPr>
-        <w:t>. Aceptación por Firebase no garantiza recepción. Apertura no equivale a atención ni comprensión. La lectura incluida en un aviso es histórica.</w:t>
-      </w:r>
-    </w:p>
-    <w:p>
-      <w:r>
-        <w:rPr>
-          <w:b w:val="0"/>
-        </w:rPr>
-        <w:t>Si no llega, consulte el capítulo 24 antes de repetir. Hay separación mínima entre pruebas, espera mientras existan entregas pendientes y guardas de consumo. No use envíos repetidos para intentar forzar la recepción. Este manual no ejecuta por sí mismo pruebas cloud.</w:t>
+        <w:t>, que se abrió la notificación. Cada etapa informa algo diferente. Para atender el aviso debe realizar la acción del capítulo 09 o 13.</w:t>
+      </w:r>
+    </w:p>
+    <w:p>
+      <w:r>
+        <w:rPr>
+          <w:b w:val="0"/>
+        </w:rPr>
+        <w:t>Si no llega, consulte el capítulo 24 antes de repetir. El sistema exige una espera entre pruebas y limita los envíos para cuidar el uso de los servicios gratuitos. Mientras haya envíos pendientes puede impedir una prueba nueva.</w:t>
       </w:r>
     </w:p>
     <w:p>
@@ -7739,7 +7811,7 @@
         <w:rPr>
           <w:b w:val="0"/>
         </w:rPr>
-        <w:t xml:space="preserve"> prueba adquisición sintética, reglas, persistencia y opcionalmente push. Es diferente de la prueba rápida cloud y de Explorar demostración.</w:t>
+        <w:t xml:space="preserve"> genera mediciones de ejemplo en la PC, aplica las reglas y guarda los resultados. También puede enviar avisos al teléfono si usted lo autoriza. Sirve para ensayar más pasos que la prueba rápida desde la nube.</w:t>
       </w:r>
     </w:p>
     <w:p>
@@ -7763,7 +7835,7 @@
         <w:rPr>
           <w:b w:val="0"/>
         </w:rPr>
-        <w:t>2. Seleccione una PC vinculada y con contacto reciente. Compruebe la hora del diagnóstico; una respuesta antigua no acredita disponibilidad actual.</w:t>
+        <w:t>2. Seleccione una PC vinculada que se haya comunicado recientemente. Revise la hora del diagnóstico para saber cuándo se comprobó su conexión.</w:t>
       </w:r>
     </w:p>
     <w:p>
@@ -7775,7 +7847,7 @@
         <w:rPr>
           <w:b w:val="0"/>
         </w:rPr>
-        <w:t>3. Elija el escenario Temperatura, MQ135 o Ambos y revise temperatura, humedad y ADC sintéticos.</w:t>
+        <w:t>3. Elija el escenario Temperatura, MQ135 o Ambos y revise los valores de ejemplo de temperatura, humedad y ADC.</w:t>
       </w:r>
     </w:p>
     <w:p>
@@ -7799,7 +7871,7 @@
         <w:rPr>
           <w:b w:val="0"/>
         </w:rPr>
-        <w:t xml:space="preserve">5. Si comprobará push, marque </w:t>
+        <w:t xml:space="preserve">5. Si comprobará el envío al teléfono, marque </w:t>
       </w:r>
       <w:r>
         <w:rPr>
@@ -7811,7 +7883,7 @@
         <w:rPr>
           <w:b w:val="0"/>
         </w:rPr>
-        <w:t>. Si no, el ensayo no enviará esos avisos.</w:t>
+        <w:t>. Si deja la casilla desmarcada, el ensayo no enviará esos avisos.</w:t>
       </w:r>
     </w:p>
     <w:p>
@@ -7823,7 +7895,7 @@
         <w:rPr>
           <w:b w:val="0"/>
         </w:rPr>
-        <w:t xml:space="preserve">6. Solo si corresponde interrumpir una adquisición en curso, autorice </w:t>
+        <w:t xml:space="preserve">6. Si necesita interrumpir la lectura del Arduino, autorice </w:t>
       </w:r>
       <w:r>
         <w:rPr>
@@ -7835,7 +7907,7 @@
         <w:rPr>
           <w:b w:val="0"/>
         </w:rPr>
-        <w:t>. No marque esa opción sin comprobar el uso del equipo.</w:t>
+        <w:t>. Compruebe antes que esa lectura no deba continuar.</w:t>
       </w:r>
     </w:p>
     <w:p>
@@ -7871,7 +7943,7 @@
         <w:rPr>
           <w:b w:val="0"/>
         </w:rPr>
-        <w:t xml:space="preserve">8. Siga la traza: medición guardada, alarma confirmada y etapas de entrega. Use </w:t>
+        <w:t xml:space="preserve">8. Revise si se guardó la medición, se confirmó el aviso y se completaron las etapas de envío. Use </w:t>
       </w:r>
       <w:r>
         <w:rPr>
@@ -7883,7 +7955,7 @@
         <w:rPr>
           <w:b w:val="0"/>
         </w:rPr>
-        <w:t xml:space="preserve"> para revisar bloqueos y </w:t>
+        <w:t xml:space="preserve"> para revisar impedimentos y </w:t>
       </w:r>
       <w:r>
         <w:rPr>
@@ -7895,15 +7967,15 @@
         <w:rPr>
           <w:b w:val="0"/>
         </w:rPr>
-        <w:t xml:space="preserve"> si necesita finalizar.</w:t>
-      </w:r>
-    </w:p>
-    <w:p>
-      <w:r>
-        <w:rPr>
-          <w:b w:val="0"/>
-        </w:rPr>
-        <w:t>Resultado esperado: el ensayo termina, la fuente deja de simular y sus registros permanecen identificados. Una lectura recuperada no elimina el aviso pendiente; atiéndalo si corresponde y vuelva a comprobar la fuente antes de continuar con Arduino.</w:t>
+        <w:t xml:space="preserve"> para terminar antes del plazo.</w:t>
+      </w:r>
+    </w:p>
+    <w:p>
+      <w:r>
+        <w:rPr>
+          <w:b w:val="0"/>
+        </w:rPr>
+        <w:t>Al terminar, la PC deja de generar mediciones simuladas y conserva los datos de la prueba con su identificación. Revise si quedó un aviso pendiente. Antes de volver al monitoreo real, compruebe que el Arduino esté conectado y recibiendo mediciones.</w:t>
       </w:r>
     </w:p>
     <w:p>
@@ -7923,15 +7995,15 @@
         <w:rPr>
           <w:b w:val="0"/>
         </w:rPr>
-        <w:t xml:space="preserve"> informa un impedimento, resuélvalo en su origen. La prueba no debe empezar con una PC sin contacto verificable ni sustituyendo USB silenciosamente. El diagnóstico del código local posterior a 0.8.0 tiene mejoras adicionales; el portable 0.8.0 publicado conserva su versión original.</w:t>
-      </w:r>
-    </w:p>
-    <w:p>
-      <w:r>
-        <w:rPr>
-          <w:b w:val="0"/>
-        </w:rPr>
-        <w:t>Las reservas propias son 80 entregas operativas y 20 de simulación por día, sin préstamo entre ambas. Son guardas de la aplicación, no cuotas oficiales. Otras guardas pueden pausar sincronización aunque todavía quede cupo push. No cambie de plan ni desactive protecciones para terminar un ensayo.</w:t>
+        <w:t xml:space="preserve"> informa un impedimento, lea el motivo y compruebe la conexión de la PC. Si la prueba necesita detener USB, debe autorizarlo expresamente. Algunas mejoras recientes del diagnóstico todavía no están incluidas en el portable 0.8.0; consulte al responsable si necesita actualizarlo.</w:t>
+      </w:r>
+    </w:p>
+    <w:p>
+      <w:r>
+        <w:rPr>
+          <w:b w:val="0"/>
+        </w:rPr>
+        <w:t>El sistema reserva por día 80 entregas para avisos reales y 20 para simulaciones. Una entrega corresponde a un teléfono destinatario; un aviso dirigido a varios teléfonos puede consumir varias. Los sobrantes de un grupo no pasan al otro. Son límites de SFA Aire, no las cuotas oficiales de los proveedores. También hay límites de almacenamiento y envío de datos. Si bloquean una prueba, consulte al responsable sin cambiar de plan ni desactivar las protecciones.</w:t>
       </w:r>
     </w:p>
     <w:p>
@@ -7944,7 +8016,7 @@
         <w:pStyle w:val="Heading1"/>
       </w:pPr>
       <w:r>
-        <w:t>24 Resolver problemas de acceso lecturas y avisos</w:t>
+        <w:t>24 Solucionar problemas frecuentes</w:t>
       </w:r>
       <w:bookmarkStart w:id="25" w:name="cap_25"/>
       <w:bookmarkEnd w:id="25"/>
@@ -8120,7 +8192,7 @@
                 <w:color w:val="000000"/>
                 <w:sz w:val="19"/>
               </w:rPr>
-              <w:t>Compruebe que la carga terminó. Revise cuenta, aceptación y membresía con el administrador; no cree cuentas duplicadas.</w:t>
+              <w:t>Espere a que termine la carga. Si la lista sigue vacía, pida al administrador que revise su cuenta y su acceso al aula.</w:t>
             </w:r>
           </w:p>
         </w:tc>
@@ -8340,7 +8412,7 @@
                 <w:color w:val="000000"/>
                 <w:sz w:val="19"/>
               </w:rPr>
-              <w:t>Compruebe firmware, 115200, DHT correcto y diagnóstico. Abrir el COM no prueba sensores.</w:t>
+              <w:t>Pida al responsable que revise el programa de Arduino, la comunicación a 115200 baudios y el modelo DHT conectado.</w:t>
             </w:r>
           </w:p>
         </w:tc>
@@ -8395,7 +8467,7 @@
                 <w:color w:val="000000"/>
                 <w:sz w:val="19"/>
               </w:rPr>
-              <w:t>Revise PC encendida, USB, última trama y paquetes pendientes. No interprete la última lectura como actual.</w:t>
+              <w:t>Compruebe que la PC esté encendida, el USB conectado y la hora de recepción se actualice. Revise si hay envíos pendientes.</w:t>
             </w:r>
           </w:p>
         </w:tc>
@@ -8505,7 +8577,7 @@
                 <w:color w:val="000000"/>
                 <w:sz w:val="19"/>
               </w:rPr>
-              <w:t>Confirme aula registrada, AVISOS ACTIVOS, permiso Android, Google Play, internet y simulaciones guardadas si es ensayo. Consulte traza y cupos.</w:t>
+              <w:t>Revise el aula registrada, AVISOS ACTIVOS, permiso Android, servicios Google Play e internet. Si es una prueba, confirme que guardó Incluir simulaciones.</w:t>
             </w:r>
           </w:p>
         </w:tc>
@@ -8535,7 +8607,7 @@
                 <w:color w:val="000000"/>
                 <w:sz w:val="19"/>
               </w:rPr>
-              <w:t>FCM aceptó pero no hay recibido</w:t>
+              <w:t>Firebase aceptó el envío pero el teléfono no lo recibió</w:t>
             </w:r>
           </w:p>
         </w:tc>
@@ -8560,7 +8632,7 @@
                 <w:color w:val="000000"/>
                 <w:sz w:val="19"/>
               </w:rPr>
-              <w:t>Aún no hay evidencia de recepción. Revise teléfono, sesión, restricciones de batería/red y permiso. No repita envíos sin diagnóstico.</w:t>
+              <w:t>Revise sesión, conexión, permiso y restricciones de batería del teléfono. Consulte el detalle del envío antes de repetir la prueba.</w:t>
             </w:r>
           </w:p>
         </w:tc>
@@ -8615,7 +8687,7 @@
                 <w:color w:val="000000"/>
                 <w:sz w:val="19"/>
               </w:rPr>
-              <w:t>Confirme rol docente/admin, sesión, red y estado vigente. Un observador o DEMO no guarda atención.</w:t>
+              <w:t>Necesita una cuenta docente o administradora, conexión y un aviso pendiente. En demostración no se guardan cambios.</w:t>
             </w:r>
           </w:p>
         </w:tc>
@@ -8670,7 +8742,7 @@
                 <w:color w:val="000000"/>
                 <w:sz w:val="19"/>
               </w:rPr>
-              <w:t>Conserve el formulario, recupere red y revise si cambió el aviso. No suponga éxito por haber pulsado el botón.</w:t>
+              <w:t>Conserve el formulario, compruebe la conexión y revise si cambió el aviso. Espere la confirmación antes de darlo por guardado.</w:t>
             </w:r>
           </w:p>
         </w:tc>
@@ -8686,7 +8758,7 @@
         <w:rPr>
           <w:b w:val="0"/>
         </w:rPr>
-        <w:t>Antes de pedir ayuda, anote versión, hora, aula, pantalla, mensaje exacto y si es dato real o simulado. Puede adjuntar una captura revisada sin contraseñas, invitaciones ni información privada. El administrador puede consultar los identificadores de aviso y entrega para relacionar las etapas.</w:t>
+        <w:t>Para pedir ayuda, indique la versión, el aula, la hora y el mensaje exacto que apareció. Aclare si estaba usando datos reales o una simulación. Si envía una captura, compruebe que no muestre una contraseña, una invitación privada u otros datos personales. El administrador puede consultar el número del aviso y de su envío para localizar el problema.</w:t>
       </w:r>
     </w:p>
     <w:p>
@@ -8699,7 +8771,7 @@
         <w:pStyle w:val="Heading1"/>
       </w:pPr>
       <w:r>
-        <w:t>25 Cerrar actualizar y proteger la instalación</w:t>
+        <w:t>25 Cerrar el sistema y cuidar sus datos</w:t>
       </w:r>
       <w:bookmarkStart w:id="26" w:name="cap_26"/>
       <w:bookmarkEnd w:id="26"/>
@@ -8709,7 +8781,7 @@
         <w:rPr>
           <w:b w:val="0"/>
         </w:rPr>
-        <w:t>Al terminar una jornada, revise los avisos pendientes y el estado de la fuente. Si necesita adquirir sensores durante la noche, la PC y el receptor deben seguir funcionando y no suspenderse. Cerrar el navegador no detiene la adquisición. Elija conscientemente si conservar o detener el monitoreo al salir del panel.</w:t>
+        <w:t>Al terminar la jornada, revise los avisos pendientes. Si necesita seguir recibiendo mediciones durante la noche, mantenga la PC encendida, sin suspenderse y con el receptor en funcionamiento. Cerrar el navegador no detiene la lectura; al salir del panel puede elegir si mantiene o detiene el monitoreo.</w:t>
       </w:r>
     </w:p>
     <w:p>
@@ -8729,23 +8801,23 @@
         <w:rPr>
           <w:b w:val="0"/>
         </w:rPr>
-        <w:t>. Esto separa el registro de la sesión anterior. Si informa un fallo de desvinculación, solicite revisión administrativa antes de reasignar el teléfono; no suponga que el cierre local completó el retiro remoto.</w:t>
-      </w:r>
-    </w:p>
-    <w:p>
-      <w:r>
-        <w:rPr>
-          <w:b w:val="0"/>
-        </w:rPr>
-        <w:t>Para actualizar Android, conserve el APK oficial y use una versión compatible con la firma piloto. Después compruebe versión, acceso, aula, registro de avisos y preferencia de simulación. Borrar datos o desinstalar elimina el archivo personal; no es el primer paso de diagnóstico.</w:t>
-      </w:r>
-    </w:p>
-    <w:p>
-      <w:r>
-        <w:rPr>
-          <w:b w:val="0"/>
-        </w:rPr>
-        <w:t>Para actualizar Windows, detenga el receptor de la carpeta que va a reemplazar y siga las instrucciones de la nueva entrega. Antes de mover una instalación usada, solicite respaldo de configuración y datos al responsable. No superponga archivos de versiones distintas ni elimine carpetas de datos como solución rápida.</w:t>
+        <w:t>. Así sale de su cuenta y solicita retirar el registro de avisos de esa sesión. Si aparece un error al desvincular, pida al administrador que revise el registro antes de entregar el teléfono a otra persona.</w:t>
+      </w:r>
+    </w:p>
+    <w:p>
+      <w:r>
+        <w:rPr>
+          <w:b w:val="0"/>
+        </w:rPr>
+        <w:t>Para actualizar la app Android, instale el APK compatible que le entregue el responsable sobre la app anterior. Después revise la versión, el aula y el registro de avisos. Recuerde que borrar los datos o desinstalar elimina su archivo personal de avisos.</w:t>
+      </w:r>
+    </w:p>
+    <w:p>
+      <w:r>
+        <w:rPr>
+          <w:b w:val="0"/>
+        </w:rPr>
+        <w:t>Para actualizar SFA Aire en Windows, detenga el receptor de la carpeta que va a reemplazar y siga las instrucciones de la nueva entrega. Antes de mover una instalación usada, solicite una copia de seguridad de la configuración y los datos al responsable. No mezcle archivos de versiones distintas ni elimine carpetas de datos como solución rápida.</w:t>
       </w:r>
     </w:p>
     <w:tbl>
@@ -8990,15 +9062,15 @@
         <w:rPr>
           <w:b w:val="0"/>
         </w:rPr>
-        <w:t>Para entregar el programa a otra persona, comparta el ZIP original del release y la APK oficial. No recomprima una carpeta que ya usó. Cierre sesión antes de compartir una PC. No copie una cuenta de servicio Firebase a teléfonos ni al navegador.</w:t>
-      </w:r>
-    </w:p>
-    <w:p>
-      <w:r>
-        <w:rPr>
-          <w:b w:val="0"/>
-        </w:rPr>
-        <w:t>Supabase Free y Firebase Spark se mantienen sin Billing. Las guardas no garantizan disponibilidad ilimitada. Un cambio de plan o eliminación de datos no forma parte de la operación normal ni del procedimiento de reparación de este manual.</w:t>
+        <w:t>Para entregar el programa a otra persona, comparta el ZIP original de la descarga y el APK oficial. Una carpeta que ya utilizó puede contener datos y accesos privados: no la comprima para distribuirla. Cierre su sesión antes de compartir una PC.</w:t>
+      </w:r>
+    </w:p>
+    <w:p>
+      <w:r>
+        <w:rPr>
+          <w:b w:val="0"/>
+        </w:rPr>
+        <w:t>SFA Aire utiliza Supabase Free y Firebase Spark sin facturación vinculada. Son servicios con límites de uso y pueden interrumpirse al agotarlos. Si aparece un problema de cuota, comuníquelo al responsable; no active un plan de pago ni elimine datos para continuar.</w:t>
       </w:r>
     </w:p>
     <w:p>
@@ -9011,7 +9083,7 @@
         <w:pStyle w:val="Heading1"/>
       </w:pPr>
       <w:r>
-        <w:t>26 Comprobación de primera puesta en funcionamiento</w:t>
+        <w:t>26 Comprobar el primer uso</w:t>
       </w:r>
       <w:bookmarkStart w:id="27" w:name="cap_27"/>
       <w:bookmarkEnd w:id="27"/>
@@ -9021,7 +9093,7 @@
         <w:rPr>
           <w:b w:val="0"/>
         </w:rPr>
-        <w:t>Use esta lista después de instalar. Marque únicamente lo observado; si algo falta, anote el motivo y la persona que debe intervenir.</w:t>
+        <w:t>Complete esta lista durante la prueba de su instalación. Si un paso no pudo comprobarse, anote qué falta y quién puede ayudar.</w:t>
       </w:r>
     </w:p>
     <w:p>
@@ -9077,7 +9149,7 @@
         <w:rPr>
           <w:b w:val="0"/>
         </w:rPr>
-        <w:t>- La persona reconoce origen real/simulado, antigüedad y valores no disponibles.</w:t>
+        <w:t>- La persona distingue datos reales y simulados, y sabe reconocer una lectura antigua o no disponible.</w:t>
       </w:r>
     </w:p>
     <w:p>
@@ -9089,7 +9161,7 @@
         <w:rPr>
           <w:b w:val="0"/>
         </w:rPr>
-        <w:t>- Puede consultar Avisos e Historial y entiende que atender y normalizar son hechos distintos.</w:t>
+        <w:t>- Puede consultar Avisos e Historial y sabe que atender un aviso no significa que los valores hayan vuelto a la normalidad.</w:t>
       </w:r>
     </w:p>
     <w:p>
@@ -9177,7 +9249,7 @@
         <w:rPr>
           <w:b w:val="0"/>
         </w:rPr>
-        <w:t>- Se confirmó placa, firmware, tipo DHT, pinout, alimentación y cable de datos.</w:t>
+        <w:t>- Se revisaron la placa, el programa de Arduino, el modelo DHT, las conexiones de los pines, la alimentación y el cable USB.</w:t>
       </w:r>
     </w:p>
     <w:p>
@@ -9213,7 +9285,7 @@
         <w:rPr>
           <w:b w:val="0"/>
         </w:rPr>
-        <w:t>- Las muestras físicas coinciden por origen y fecha entre PC, nube y Android, considerando el intervalo de sincronización.</w:t>
+        <w:t>- Se encuentran las mediciones de la maqueta en PC, nube y Android, con su fecha y teniendo en cuenta el tiempo de sincronización.</w:t>
       </w:r>
     </w:p>
     <w:p>
@@ -9225,23 +9297,23 @@
         <w:rPr>
           <w:b w:val="0"/>
         </w:rPr>
-        <w:t>- Al detener o desconectar se ve la pérdida de vigencia, sin declarar aire normal.</w:t>
-      </w:r>
-    </w:p>
-    <w:p>
-      <w:r>
-        <w:rPr>
-          <w:b w:val="0"/>
-        </w:rPr>
-        <w:t>La existencia de esta lista no acredita su cumplimiento. Las evidencias previas de push real pertenecen a ensayos concretos; no sustituyen la aceptación de una nueva versión o instalación. El alta de otra persona, el montaje físico y Android 0.8.2 en A02 tienen validaciones externas pendientes en las fuentes consultadas.</w:t>
-      </w:r>
-    </w:p>
-    <w:p>
-      <w:r>
-        <w:rPr>
-          <w:b w:val="0"/>
-        </w:rPr>
-        <w:t>Registro sugerido: fecha y hora, versión, PC/teléfono, aula, responsable, comprobaciones completadas, resultado observado y pendientes. No anote contraseñas ni enlaces privados en ese registro.</w:t>
+        <w:t>- Al detener o desconectar la maqueta, aparece la indicación de que faltan datos recientes.</w:t>
+      </w:r>
+    </w:p>
+    <w:p>
+      <w:r>
+        <w:rPr>
+          <w:b w:val="0"/>
+        </w:rPr>
+        <w:t>Repita estas comprobaciones en su propia instalación. Las pruebas anteriores del proyecto no sustituyen las de una nueva versión o dispositivo. Al preparar esta edición todavía faltaban la prueba de alta con otra persona, la comprobación del montaje físico y el ensayo de Android 0.8.2 en el Samsung A02.</w:t>
+      </w:r>
+    </w:p>
+    <w:p>
+      <w:r>
+        <w:rPr>
+          <w:b w:val="0"/>
+        </w:rPr>
+        <w:t>Anote la fecha, la versión, el aula, los equipos utilizados y el resultado de la prueba. Deje también una lista de los pasos pendientes. No incluya contraseñas ni enlaces privados.</w:t>
       </w:r>
     </w:p>
     <w:p>
@@ -9254,7 +9326,7 @@
         <w:pStyle w:val="Heading1"/>
       </w:pPr>
       <w:r>
-        <w:t>27 Glosario alcance y referencias de la guía</w:t>
+        <w:t>27 Glosario y referencias</w:t>
       </w:r>
       <w:bookmarkStart w:id="28" w:name="cap_28"/>
       <w:bookmarkEnd w:id="28"/>
@@ -9430,7 +9502,7 @@
                 <w:color w:val="000000"/>
                 <w:sz w:val="19"/>
               </w:rPr>
-              <w:t>Equipo que recibe Arduino y sincroniza; no es un celular.</w:t>
+              <w:t>PC que recibe las mediciones de Arduino por USB y las envía a la nube.</w:t>
             </w:r>
           </w:p>
         </w:tc>
@@ -9625,7 +9697,7 @@
                 <w:color w:val="000000"/>
                 <w:sz w:val="19"/>
               </w:rPr>
-              <w:t>Push o FCM</w:t>
+              <w:t>Notificación push</w:t>
             </w:r>
           </w:p>
         </w:tc>
@@ -9650,7 +9722,7 @@
                 <w:color w:val="000000"/>
                 <w:sz w:val="19"/>
               </w:rPr>
-              <w:t>Entrega por internet al teléfono registrado mediante Firebase Cloud Messaging.</w:t>
+              <w:t>Aviso que llega al teléfono. SFA Aire utiliza el servicio Firebase Cloud Messaging, conocido como FCM, para enviarlo.</w:t>
             </w:r>
           </w:p>
         </w:tc>
@@ -9705,7 +9777,7 @@
                 <w:color w:val="000000"/>
                 <w:sz w:val="19"/>
               </w:rPr>
-              <w:t>Evidencias de llegada a app y apertura; no acreditan comprensión o acción física.</w:t>
+              <w:t>Recibido indica que la app confirmó la llegada. Abierto indica que se abrió la notificación; no que se atendió el aviso.</w:t>
             </w:r>
           </w:p>
         </w:tc>
@@ -9760,7 +9832,7 @@
                 <w:color w:val="000000"/>
                 <w:sz w:val="19"/>
               </w:rPr>
-              <w:t>Estado compartido de atención humana del aviso.</w:t>
+              <w:t>Aviso que una persona autorizada marcó como atendido; ese estado se comparte con el aula.</w:t>
             </w:r>
           </w:p>
         </w:tc>
@@ -9870,7 +9942,7 @@
                 <w:color w:val="000000"/>
                 <w:sz w:val="19"/>
               </w:rPr>
-              <w:t>Datos sintéticos; un ensayo autorizado puede generar una notificación real.</w:t>
+              <w:t>Datos generados para una prueba; pueden producir una notificación real si el administrador habilita el envío.</w:t>
             </w:r>
           </w:p>
         </w:tc>
@@ -9900,7 +9972,7 @@
                 <w:color w:val="000000"/>
                 <w:sz w:val="19"/>
               </w:rPr>
-              <w:t>Cola pendiente</w:t>
+              <w:t>Envíos pendientes</w:t>
             </w:r>
           </w:p>
         </w:tc>
@@ -9925,7 +9997,7 @@
                 <w:color w:val="000000"/>
                 <w:sz w:val="19"/>
               </w:rPr>
-              <w:t>Trabajo guardado que todavía necesita sincronización o entrega.</w:t>
+              <w:t>Mediciones o notificaciones guardadas que todavía deben enviarse.</w:t>
             </w:r>
           </w:p>
         </w:tc>
@@ -9941,31 +10013,31 @@
         <w:rPr>
           <w:b w:val="0"/>
         </w:rPr>
-        <w:t>Esta edición describe la operación de la infraestructura SFA Aire ya configurada. No enseña a crear proyectos cloud nuevos, ejecutar SQL, contratar servicios, publicar código o distribuir una app con firma de producción. Esas tareas requieren documentación técnica y una identidad autorizada.</w:t>
-      </w:r>
-    </w:p>
-    <w:p>
-      <w:r>
-        <w:rPr>
-          <w:b w:val="0"/>
-        </w:rPr>
-        <w:t>Fuentes contrastadas: README y código de pantallas del portal; docs/GUIA_PUBLICA.md; PORTAL_PUBLICO_E_INVITACIONES.md; ATENCION_SIMPLE.md; CONEXION_ARDUINO.md; HARDWARE.md; IMPLEMENTACION_UI_080.md; ANDROID_082_AVISOS_Y_BANDEJA.md; Entregas/ANDROID_ACTUAL.json. Se prefirió la versión actual sobre guías históricas que aún describen coordinación obligatoria o APK antiguas.</w:t>
-      </w:r>
-    </w:p>
-    <w:p>
-      <w:r>
-        <w:rPr>
-          <w:b w:val="0"/>
-        </w:rPr>
-        <w:t>Las capturas web de 0.8.0 y las pantallas de invitación/administración proceden de pruebas controladas conservadas en el proyecto. Las capturas Android son nativas de 0.8.2 en emulador y DEMO. El archivo de trazabilidad adjunto identifica cada imagen. No contienen una invitación utilizable ni datos de acceso reales.</w:t>
-      </w:r>
-    </w:p>
-    <w:p>
-      <w:r>
-        <w:rPr>
-          <w:b w:val="0"/>
-        </w:rPr>
-        <w:t>Para consultar: https://sfa-aire-aulas.web.app/remoto. Para archivos publicados: https://github.com/hfreedo/SFA-Aire-Portal/releases. Se verificaron el portal y el ZIP Windows 0.8.0; Android 0.8.2 estaba disponible localmente pero no en releases públicos al cerrar esta edición. Los enlaces temporales Wi-Fi y las invitaciones privadas no se incluyen en este manual.</w:t>
+        <w:t>Esta edición explica cómo usar SFA Aire con los servicios ya configurados. La creación de proyectos en internet, los cambios de base de datos y la publicación de nuevas versiones corresponden al responsable técnico y se documentan por separado.</w:t>
+      </w:r>
+    </w:p>
+    <w:p>
+      <w:r>
+        <w:rPr>
+          <w:b w:val="0"/>
+        </w:rPr>
+        <w:t>Para ampliar la información, los documentos del proyecto explican la instalación y privacidad en GUIA_PUBLICA.md; las invitaciones en PORTAL_PUBLICO_E_INVITACIONES.md; la conexión y sensores en CONEXION_ARDUINO.md y HARDWARE.md; y las funciones Android en ANDROID_082_AVISOS_Y_BANDEJA.md. La versión de la app se identifica en Entregas/ANDROID_ACTUAL.json.</w:t>
+      </w:r>
+    </w:p>
+    <w:p>
+      <w:r>
+        <w:rPr>
+          <w:b w:val="0"/>
+        </w:rPr>
+        <w:t>Las capturas muestran el portal, sus formularios y Android 0.8.2 con datos de ejemplo. Los archivos TRAZABILIDAD.json y CAPTURAS_PUBLICADAS.json identifican sus orígenes. No se incluyen contraseñas ni invitaciones utilizables.</w:t>
+      </w:r>
+    </w:p>
+    <w:p>
+      <w:r>
+        <w:rPr>
+          <w:b w:val="0"/>
+        </w:rPr>
+        <w:t>Portal: https://sfa-aire-aulas.web.app/remoto. Descargas: https://github.com/hfreedo/SFA-Aire-Portal/releases. Al preparar esta edición, Windows 0.8.0 estaba publicado y Android 0.8.2 debía solicitarse al responsable. No se incluyen enlaces temporales de Wi-Fi ni invitaciones privadas.</w:t>
       </w:r>
     </w:p>
     <w:sectPr>

</xml_diff>